<commit_message>
Aug 18, 2026, 7:15 PM
</commit_message>
<xml_diff>
--- a/docs/CCTV-Google-Drive-User-Guide-TH.docx
+++ b/docs/CCTV-Google-Drive-User-Guide-TH.docx
@@ -10,7 +10,7 @@
       </w:pPr>
       <w:r>
         <w:rPr>
-          <w:rFonts w:ascii="Tahoma" w:hAnsi="Tahoma" w:eastAsia="Tahoma"/>
+          <w:rFonts w:ascii="Thonburi" w:hAnsi="Thonburi" w:eastAsia="Thonburi"/>
           <w:b/>
           <w:color w:val="0072CE"/>
           <w:sz w:val="20"/>
@@ -27,7 +27,7 @@
         <w:drawing>
           <wp:inline xmlns:a="http://schemas.openxmlformats.org/drawingml/2006/main" xmlns:pic="http://schemas.openxmlformats.org/drawingml/2006/picture">
             <wp:extent cx="1417320" cy="596766"/>
-            <wp:docPr id="1" name="Picture 1"/>
+            <wp:docPr id="1" name="Picture 1" descr="National Telecom company logo" title="National Telecom logo"/>
             <wp:cNvGraphicFramePr>
               <a:graphicFrameLocks noChangeAspect="1"/>
             </wp:cNvGraphicFramePr>
@@ -39,7 +39,7 @@
                     <pic:cNvPicPr/>
                   </pic:nvPicPr>
                   <pic:blipFill>
-                    <a:blip r:embed="rId11"/>
+                    <a:blip r:embed="rId13"/>
                     <a:stretch>
                       <a:fillRect/>
                     </a:stretch>
@@ -66,7 +66,7 @@
       </w:pPr>
       <w:r>
         <w:rPr>
-          <w:rFonts w:ascii="Tahoma" w:hAnsi="Tahoma" w:eastAsia="Tahoma"/>
+          <w:rFonts w:ascii="Thonburi" w:hAnsi="Thonburi" w:eastAsia="Thonburi"/>
           <w:b/>
           <w:color w:val="0B2545"/>
           <w:sz w:val="56"/>
@@ -82,7 +82,7 @@
       </w:pPr>
       <w:r>
         <w:rPr>
-          <w:rFonts w:ascii="Tahoma" w:hAnsi="Tahoma" w:eastAsia="Tahoma"/>
+          <w:rFonts w:ascii="Thonburi" w:hAnsi="Thonburi" w:eastAsia="Thonburi"/>
           <w:b/>
           <w:color w:val="0072CE"/>
           <w:sz w:val="40"/>
@@ -98,7 +98,7 @@
       </w:pPr>
       <w:r>
         <w:rPr>
-          <w:rFonts w:ascii="Tahoma" w:hAnsi="Tahoma" w:eastAsia="Tahoma"/>
+          <w:rFonts w:ascii="Thonburi" w:hAnsi="Thonburi" w:eastAsia="Thonburi"/>
           <w:b w:val="0"/>
           <w:color w:val="596579"/>
           <w:sz w:val="24"/>
@@ -118,7 +118,7 @@
       </w:pPr>
       <w:r>
         <w:rPr>
-          <w:rFonts w:ascii="Tahoma" w:hAnsi="Tahoma" w:eastAsia="Tahoma"/>
+          <w:rFonts w:ascii="Thonburi" w:hAnsi="Thonburi" w:eastAsia="Thonburi"/>
           <w:b/>
           <w:color w:val="0072CE"/>
           <w:sz w:val="21"/>
@@ -127,7 +127,7 @@
       </w:r>
       <w:r>
         <w:rPr>
-          <w:rFonts w:ascii="Tahoma" w:hAnsi="Tahoma" w:eastAsia="Tahoma"/>
+          <w:rFonts w:ascii="Thonburi" w:hAnsi="Thonburi" w:eastAsia="Thonburi"/>
           <w:color w:val="172033"/>
           <w:sz w:val="21"/>
         </w:rPr>
@@ -142,7 +142,7 @@
       </w:pPr>
       <w:r>
         <w:rPr>
-          <w:rFonts w:ascii="Tahoma" w:hAnsi="Tahoma" w:eastAsia="Tahoma"/>
+          <w:rFonts w:ascii="Thonburi" w:hAnsi="Thonburi" w:eastAsia="Thonburi"/>
           <w:b w:val="0"/>
           <w:color w:val="596579"/>
           <w:sz w:val="19"/>
@@ -170,7 +170,7 @@
       </w:pPr>
       <w:r>
         <w:rPr>
-          <w:rFonts w:ascii="Tahoma" w:hAnsi="Tahoma" w:eastAsia="Tahoma"/>
+          <w:rFonts w:ascii="Thonburi" w:hAnsi="Thonburi" w:eastAsia="Thonburi"/>
           <w:b w:val="0"/>
           <w:color w:val="172033"/>
           <w:sz w:val="22"/>
@@ -197,7 +197,7 @@
       </w:pPr>
       <w:r>
         <w:rPr>
-          <w:rFonts w:ascii="Tahoma" w:hAnsi="Tahoma" w:eastAsia="Tahoma"/>
+          <w:rFonts w:ascii="Thonburi" w:hAnsi="Thonburi" w:eastAsia="Thonburi"/>
           <w:b/>
           <w:color w:val="0B2545"/>
           <w:sz w:val="22"/>
@@ -206,7 +206,7 @@
       </w:r>
       <w:r>
         <w:rPr>
-          <w:rFonts w:ascii="Tahoma" w:hAnsi="Tahoma" w:eastAsia="Tahoma"/>
+          <w:rFonts w:ascii="Thonburi" w:hAnsi="Thonburi" w:eastAsia="Thonburi"/>
           <w:color w:val="172033"/>
           <w:sz w:val="22"/>
         </w:rPr>
@@ -224,7 +224,7 @@
       </w:pPr>
       <w:r>
         <w:rPr>
-          <w:rFonts w:ascii="Tahoma" w:hAnsi="Tahoma" w:eastAsia="Tahoma"/>
+          <w:rFonts w:ascii="Thonburi" w:hAnsi="Thonburi" w:eastAsia="Thonburi"/>
           <w:b/>
           <w:color w:val="0B2545"/>
           <w:sz w:val="22"/>
@@ -233,7 +233,7 @@
       </w:r>
       <w:r>
         <w:rPr>
-          <w:rFonts w:ascii="Tahoma" w:hAnsi="Tahoma" w:eastAsia="Tahoma"/>
+          <w:rFonts w:ascii="Thonburi" w:hAnsi="Thonburi" w:eastAsia="Thonburi"/>
           <w:color w:val="172033"/>
           <w:sz w:val="22"/>
         </w:rPr>
@@ -251,7 +251,7 @@
       </w:pPr>
       <w:r>
         <w:rPr>
-          <w:rFonts w:ascii="Tahoma" w:hAnsi="Tahoma" w:eastAsia="Tahoma"/>
+          <w:rFonts w:ascii="Thonburi" w:hAnsi="Thonburi" w:eastAsia="Thonburi"/>
           <w:b/>
           <w:color w:val="0B2545"/>
           <w:sz w:val="22"/>
@@ -260,7 +260,7 @@
       </w:r>
       <w:r>
         <w:rPr>
-          <w:rFonts w:ascii="Tahoma" w:hAnsi="Tahoma" w:eastAsia="Tahoma"/>
+          <w:rFonts w:ascii="Thonburi" w:hAnsi="Thonburi" w:eastAsia="Thonburi"/>
           <w:color w:val="172033"/>
           <w:sz w:val="22"/>
         </w:rPr>
@@ -279,7 +279,7 @@
       </w:pPr>
       <w:r>
         <w:rPr>
-          <w:rFonts w:ascii="Tahoma" w:hAnsi="Tahoma" w:eastAsia="Tahoma"/>
+          <w:rFonts w:ascii="Thonburi" w:hAnsi="Thonburi" w:eastAsia="Thonburi"/>
           <w:b/>
           <w:color w:val="9A7500"/>
           <w:sz w:val="21"/>
@@ -288,7 +288,7 @@
       </w:r>
       <w:r>
         <w:rPr>
-          <w:rFonts w:ascii="Tahoma" w:hAnsi="Tahoma" w:eastAsia="Tahoma"/>
+          <w:rFonts w:ascii="Thonburi" w:hAnsi="Thonburi" w:eastAsia="Thonburi"/>
           <w:color w:val="172033"/>
           <w:sz w:val="21"/>
         </w:rPr>
@@ -318,7 +318,7 @@
       </w:pPr>
       <w:r>
         <w:rPr>
-          <w:rFonts w:ascii="Tahoma" w:hAnsi="Tahoma" w:eastAsia="Tahoma"/>
+          <w:rFonts w:ascii="Thonburi" w:hAnsi="Thonburi" w:eastAsia="Thonburi"/>
           <w:b w:val="0"/>
           <w:color w:val="172033"/>
           <w:sz w:val="22"/>
@@ -434,7 +434,7 @@
       </w:pPr>
       <w:r>
         <w:rPr>
-          <w:rFonts w:ascii="Tahoma" w:hAnsi="Tahoma" w:eastAsia="Tahoma"/>
+          <w:rFonts w:ascii="Thonburi" w:hAnsi="Thonburi" w:eastAsia="Thonburi"/>
           <w:b/>
           <w:color w:val="596579"/>
           <w:sz w:val="21"/>
@@ -443,7 +443,7 @@
       </w:r>
       <w:r>
         <w:rPr>
-          <w:rFonts w:ascii="Tahoma" w:hAnsi="Tahoma" w:eastAsia="Tahoma"/>
+          <w:rFonts w:ascii="Thonburi" w:hAnsi="Thonburi" w:eastAsia="Thonburi"/>
           <w:color w:val="172033"/>
           <w:sz w:val="21"/>
         </w:rPr>
@@ -464,12 +464,12 @@
         <w:spacing w:before="0" w:after="80" w:line="300" w:lineRule="auto"/>
         <w:numPr>
           <w:ilvl w:val="0"/>
-          <w:numId w:val="41"/>
+          <w:numId w:val="42"/>
         </w:numPr>
       </w:pPr>
       <w:r>
         <w:rPr>
-          <w:rFonts w:ascii="Tahoma" w:hAnsi="Tahoma" w:eastAsia="Tahoma"/>
+          <w:rFonts w:ascii="Thonburi" w:hAnsi="Thonburi" w:eastAsia="Thonburi"/>
           <w:b/>
           <w:color w:val="0B2545"/>
           <w:sz w:val="22"/>
@@ -478,7 +478,7 @@
       </w:r>
       <w:r>
         <w:rPr>
-          <w:rFonts w:ascii="Tahoma" w:hAnsi="Tahoma" w:eastAsia="Tahoma"/>
+          <w:rFonts w:ascii="Thonburi" w:hAnsi="Thonburi" w:eastAsia="Thonburi"/>
           <w:color w:val="172033"/>
           <w:sz w:val="22"/>
         </w:rPr>
@@ -491,12 +491,12 @@
         <w:spacing w:before="0" w:after="80" w:line="300" w:lineRule="auto"/>
         <w:numPr>
           <w:ilvl w:val="0"/>
-          <w:numId w:val="41"/>
+          <w:numId w:val="42"/>
         </w:numPr>
       </w:pPr>
       <w:r>
         <w:rPr>
-          <w:rFonts w:ascii="Tahoma" w:hAnsi="Tahoma" w:eastAsia="Tahoma"/>
+          <w:rFonts w:ascii="Thonburi" w:hAnsi="Thonburi" w:eastAsia="Thonburi"/>
           <w:b/>
           <w:color w:val="0B2545"/>
           <w:sz w:val="22"/>
@@ -505,7 +505,7 @@
       </w:r>
       <w:r>
         <w:rPr>
-          <w:rFonts w:ascii="Tahoma" w:hAnsi="Tahoma" w:eastAsia="Tahoma"/>
+          <w:rFonts w:ascii="Thonburi" w:hAnsi="Thonburi" w:eastAsia="Thonburi"/>
           <w:color w:val="172033"/>
           <w:sz w:val="22"/>
         </w:rPr>
@@ -518,12 +518,12 @@
         <w:spacing w:before="0" w:after="80" w:line="300" w:lineRule="auto"/>
         <w:numPr>
           <w:ilvl w:val="0"/>
-          <w:numId w:val="41"/>
+          <w:numId w:val="42"/>
         </w:numPr>
       </w:pPr>
       <w:r>
         <w:rPr>
-          <w:rFonts w:ascii="Tahoma" w:hAnsi="Tahoma" w:eastAsia="Tahoma"/>
+          <w:rFonts w:ascii="Thonburi" w:hAnsi="Thonburi" w:eastAsia="Thonburi"/>
           <w:b/>
           <w:color w:val="0B2545"/>
           <w:sz w:val="22"/>
@@ -532,7 +532,7 @@
       </w:r>
       <w:r>
         <w:rPr>
-          <w:rFonts w:ascii="Tahoma" w:hAnsi="Tahoma" w:eastAsia="Tahoma"/>
+          <w:rFonts w:ascii="Thonburi" w:hAnsi="Thonburi" w:eastAsia="Thonburi"/>
           <w:color w:val="172033"/>
           <w:sz w:val="22"/>
         </w:rPr>
@@ -551,7 +551,7 @@
       </w:pPr>
       <w:r>
         <w:rPr>
-          <w:rFonts w:ascii="Tahoma" w:hAnsi="Tahoma" w:eastAsia="Tahoma"/>
+          <w:rFonts w:ascii="Thonburi" w:hAnsi="Thonburi" w:eastAsia="Thonburi"/>
           <w:b/>
           <w:color w:val="9A7500"/>
           <w:sz w:val="21"/>
@@ -560,7 +560,7 @@
       </w:r>
       <w:r>
         <w:rPr>
-          <w:rFonts w:ascii="Tahoma" w:hAnsi="Tahoma" w:eastAsia="Tahoma"/>
+          <w:rFonts w:ascii="Thonburi" w:hAnsi="Thonburi" w:eastAsia="Thonburi"/>
           <w:color w:val="172033"/>
           <w:sz w:val="21"/>
         </w:rPr>
@@ -586,12 +586,12 @@
         <w:spacing w:before="0" w:after="80" w:line="300" w:lineRule="auto"/>
         <w:numPr>
           <w:ilvl w:val="0"/>
-          <w:numId w:val="41"/>
+          <w:numId w:val="43"/>
         </w:numPr>
       </w:pPr>
       <w:r>
         <w:rPr>
-          <w:rFonts w:ascii="Tahoma" w:hAnsi="Tahoma" w:eastAsia="Tahoma"/>
+          <w:rFonts w:ascii="Thonburi" w:hAnsi="Thonburi" w:eastAsia="Thonburi"/>
           <w:b/>
           <w:color w:val="0B2545"/>
           <w:sz w:val="22"/>
@@ -600,7 +600,7 @@
       </w:r>
       <w:r>
         <w:rPr>
-          <w:rFonts w:ascii="Tahoma" w:hAnsi="Tahoma" w:eastAsia="Tahoma"/>
+          <w:rFonts w:ascii="Thonburi" w:hAnsi="Thonburi" w:eastAsia="Thonburi"/>
           <w:color w:val="172033"/>
           <w:sz w:val="22"/>
         </w:rPr>
@@ -613,12 +613,12 @@
         <w:spacing w:before="0" w:after="80" w:line="300" w:lineRule="auto"/>
         <w:numPr>
           <w:ilvl w:val="0"/>
-          <w:numId w:val="41"/>
+          <w:numId w:val="43"/>
         </w:numPr>
       </w:pPr>
       <w:r>
         <w:rPr>
-          <w:rFonts w:ascii="Tahoma" w:hAnsi="Tahoma" w:eastAsia="Tahoma"/>
+          <w:rFonts w:ascii="Thonburi" w:hAnsi="Thonburi" w:eastAsia="Thonburi"/>
           <w:b/>
           <w:color w:val="0B2545"/>
           <w:sz w:val="22"/>
@@ -627,7 +627,7 @@
       </w:r>
       <w:r>
         <w:rPr>
-          <w:rFonts w:ascii="Tahoma" w:hAnsi="Tahoma" w:eastAsia="Tahoma"/>
+          <w:rFonts w:ascii="Thonburi" w:hAnsi="Thonburi" w:eastAsia="Thonburi"/>
           <w:color w:val="172033"/>
           <w:sz w:val="22"/>
         </w:rPr>
@@ -640,12 +640,12 @@
         <w:spacing w:before="0" w:after="80" w:line="300" w:lineRule="auto"/>
         <w:numPr>
           <w:ilvl w:val="0"/>
-          <w:numId w:val="41"/>
+          <w:numId w:val="43"/>
         </w:numPr>
       </w:pPr>
       <w:r>
         <w:rPr>
-          <w:rFonts w:ascii="Tahoma" w:hAnsi="Tahoma" w:eastAsia="Tahoma"/>
+          <w:rFonts w:ascii="Thonburi" w:hAnsi="Thonburi" w:eastAsia="Thonburi"/>
           <w:b/>
           <w:color w:val="0B2545"/>
           <w:sz w:val="22"/>
@@ -654,7 +654,7 @@
       </w:r>
       <w:r>
         <w:rPr>
-          <w:rFonts w:ascii="Tahoma" w:hAnsi="Tahoma" w:eastAsia="Tahoma"/>
+          <w:rFonts w:ascii="Thonburi" w:hAnsi="Thonburi" w:eastAsia="Thonburi"/>
           <w:color w:val="172033"/>
           <w:sz w:val="22"/>
         </w:rPr>
@@ -667,12 +667,12 @@
         <w:spacing w:before="0" w:after="80" w:line="300" w:lineRule="auto"/>
         <w:numPr>
           <w:ilvl w:val="0"/>
-          <w:numId w:val="41"/>
+          <w:numId w:val="43"/>
         </w:numPr>
       </w:pPr>
       <w:r>
         <w:rPr>
-          <w:rFonts w:ascii="Tahoma" w:hAnsi="Tahoma" w:eastAsia="Tahoma"/>
+          <w:rFonts w:ascii="Thonburi" w:hAnsi="Thonburi" w:eastAsia="Thonburi"/>
           <w:b/>
           <w:color w:val="0B2545"/>
           <w:sz w:val="22"/>
@@ -681,7 +681,7 @@
       </w:r>
       <w:r>
         <w:rPr>
-          <w:rFonts w:ascii="Tahoma" w:hAnsi="Tahoma" w:eastAsia="Tahoma"/>
+          <w:rFonts w:ascii="Thonburi" w:hAnsi="Thonburi" w:eastAsia="Thonburi"/>
           <w:color w:val="172033"/>
           <w:sz w:val="22"/>
         </w:rPr>
@@ -694,12 +694,12 @@
         <w:spacing w:before="0" w:after="80" w:line="300" w:lineRule="auto"/>
         <w:numPr>
           <w:ilvl w:val="0"/>
-          <w:numId w:val="41"/>
+          <w:numId w:val="43"/>
         </w:numPr>
       </w:pPr>
       <w:r>
         <w:rPr>
-          <w:rFonts w:ascii="Tahoma" w:hAnsi="Tahoma" w:eastAsia="Tahoma"/>
+          <w:rFonts w:ascii="Thonburi" w:hAnsi="Thonburi" w:eastAsia="Thonburi"/>
           <w:b/>
           <w:color w:val="0B2545"/>
           <w:sz w:val="22"/>
@@ -708,7 +708,7 @@
       </w:r>
       <w:r>
         <w:rPr>
-          <w:rFonts w:ascii="Tahoma" w:hAnsi="Tahoma" w:eastAsia="Tahoma"/>
+          <w:rFonts w:ascii="Thonburi" w:hAnsi="Thonburi" w:eastAsia="Thonburi"/>
           <w:color w:val="172033"/>
           <w:sz w:val="22"/>
         </w:rPr>
@@ -721,12 +721,12 @@
         <w:spacing w:before="0" w:after="80" w:line="300" w:lineRule="auto"/>
         <w:numPr>
           <w:ilvl w:val="0"/>
-          <w:numId w:val="41"/>
+          <w:numId w:val="43"/>
         </w:numPr>
       </w:pPr>
       <w:r>
         <w:rPr>
-          <w:rFonts w:ascii="Tahoma" w:hAnsi="Tahoma" w:eastAsia="Tahoma"/>
+          <w:rFonts w:ascii="Thonburi" w:hAnsi="Thonburi" w:eastAsia="Thonburi"/>
           <w:b/>
           <w:color w:val="0B2545"/>
           <w:sz w:val="22"/>
@@ -735,7 +735,7 @@
       </w:r>
       <w:r>
         <w:rPr>
-          <w:rFonts w:ascii="Tahoma" w:hAnsi="Tahoma" w:eastAsia="Tahoma"/>
+          <w:rFonts w:ascii="Thonburi" w:hAnsi="Thonburi" w:eastAsia="Thonburi"/>
           <w:color w:val="172033"/>
           <w:sz w:val="22"/>
         </w:rPr>
@@ -759,10 +759,10 @@
         <w:tblInd w:w="120" w:type="dxa"/>
       </w:tblPr>
       <w:tblGrid>
-        <w:gridCol w:w="1700"/>
-        <w:gridCol w:w="800"/>
-        <w:gridCol w:w="2750"/>
-        <w:gridCol w:w="4110"/>
+        <w:gridCol w:w="1600"/>
+        <w:gridCol w:w="1100"/>
+        <w:gridCol w:w="2600"/>
+        <w:gridCol w:w="4060"/>
       </w:tblGrid>
       <w:tr>
         <w:trPr>
@@ -770,7 +770,7 @@
         </w:trPr>
         <w:tc>
           <w:tcPr>
-            <w:tcW w:type="dxa" w:w="1700"/>
+            <w:tcW w:type="dxa" w:w="1600"/>
             <w:shd w:fill="0B2545"/>
             <w:tcMar>
               <w:top w:w="80" w:type="dxa"/>
@@ -787,7 +787,7 @@
             </w:pPr>
             <w:r>
               <w:rPr>
-                <w:rFonts w:ascii="Tahoma" w:hAnsi="Tahoma" w:eastAsia="Tahoma"/>
+                <w:rFonts w:ascii="Thonburi" w:hAnsi="Thonburi" w:eastAsia="Thonburi"/>
                 <w:b/>
                 <w:color w:val="FFFFFF"/>
                 <w:sz w:val="19"/>
@@ -798,7 +798,7 @@
         </w:tc>
         <w:tc>
           <w:tcPr>
-            <w:tcW w:type="dxa" w:w="800"/>
+            <w:tcW w:type="dxa" w:w="1100"/>
             <w:shd w:fill="0B2545"/>
             <w:tcMar>
               <w:top w:w="80" w:type="dxa"/>
@@ -815,7 +815,7 @@
             </w:pPr>
             <w:r>
               <w:rPr>
-                <w:rFonts w:ascii="Tahoma" w:hAnsi="Tahoma" w:eastAsia="Tahoma"/>
+                <w:rFonts w:ascii="Thonburi" w:hAnsi="Thonburi" w:eastAsia="Thonburi"/>
                 <w:b/>
                 <w:color w:val="FFFFFF"/>
                 <w:sz w:val="19"/>
@@ -826,7 +826,7 @@
         </w:tc>
         <w:tc>
           <w:tcPr>
-            <w:tcW w:type="dxa" w:w="2750"/>
+            <w:tcW w:type="dxa" w:w="2600"/>
             <w:shd w:fill="0B2545"/>
             <w:tcMar>
               <w:top w:w="80" w:type="dxa"/>
@@ -843,7 +843,7 @@
             </w:pPr>
             <w:r>
               <w:rPr>
-                <w:rFonts w:ascii="Tahoma" w:hAnsi="Tahoma" w:eastAsia="Tahoma"/>
+                <w:rFonts w:ascii="Thonburi" w:hAnsi="Thonburi" w:eastAsia="Thonburi"/>
                 <w:b/>
                 <w:color w:val="FFFFFF"/>
                 <w:sz w:val="19"/>
@@ -854,7 +854,7 @@
         </w:tc>
         <w:tc>
           <w:tcPr>
-            <w:tcW w:type="dxa" w:w="4110"/>
+            <w:tcW w:type="dxa" w:w="4060"/>
             <w:shd w:fill="0B2545"/>
             <w:tcMar>
               <w:top w:w="80" w:type="dxa"/>
@@ -871,7 +871,7 @@
             </w:pPr>
             <w:r>
               <w:rPr>
-                <w:rFonts w:ascii="Tahoma" w:hAnsi="Tahoma" w:eastAsia="Tahoma"/>
+                <w:rFonts w:ascii="Thonburi" w:hAnsi="Thonburi" w:eastAsia="Thonburi"/>
                 <w:b/>
                 <w:color w:val="FFFFFF"/>
                 <w:sz w:val="19"/>
@@ -884,7 +884,7 @@
       <w:tr>
         <w:tc>
           <w:tcPr>
-            <w:tcW w:type="dxa" w:w="1700"/>
+            <w:tcW w:type="dxa" w:w="1600"/>
             <w:tcMar>
               <w:top w:w="80" w:type="dxa"/>
               <w:start w:w="120" w:type="dxa"/>
@@ -900,7 +900,7 @@
             </w:pPr>
             <w:r>
               <w:rPr>
-                <w:rFonts w:ascii="Tahoma" w:hAnsi="Tahoma" w:eastAsia="Tahoma"/>
+                <w:rFonts w:ascii="Thonburi" w:hAnsi="Thonburi" w:eastAsia="Thonburi"/>
                 <w:color w:val="172033"/>
                 <w:sz w:val="18"/>
               </w:rPr>
@@ -910,7 +910,7 @@
         </w:tc>
         <w:tc>
           <w:tcPr>
-            <w:tcW w:type="dxa" w:w="800"/>
+            <w:tcW w:type="dxa" w:w="1100"/>
             <w:tcMar>
               <w:top w:w="80" w:type="dxa"/>
               <w:start w:w="120" w:type="dxa"/>
@@ -926,7 +926,7 @@
             </w:pPr>
             <w:r>
               <w:rPr>
-                <w:rFonts w:ascii="Tahoma" w:hAnsi="Tahoma" w:eastAsia="Tahoma"/>
+                <w:rFonts w:ascii="Thonburi" w:hAnsi="Thonburi" w:eastAsia="Thonburi"/>
                 <w:color w:val="172033"/>
                 <w:sz w:val="18"/>
               </w:rPr>
@@ -936,7 +936,7 @@
         </w:tc>
         <w:tc>
           <w:tcPr>
-            <w:tcW w:type="dxa" w:w="2750"/>
+            <w:tcW w:type="dxa" w:w="2600"/>
             <w:tcMar>
               <w:top w:w="80" w:type="dxa"/>
               <w:start w:w="120" w:type="dxa"/>
@@ -952,7 +952,7 @@
             </w:pPr>
             <w:r>
               <w:rPr>
-                <w:rFonts w:ascii="Tahoma" w:hAnsi="Tahoma" w:eastAsia="Tahoma"/>
+                <w:rFonts w:ascii="Thonburi" w:hAnsi="Thonburi" w:eastAsia="Thonburi"/>
                 <w:color w:val="172033"/>
                 <w:sz w:val="18"/>
               </w:rPr>
@@ -962,7 +962,7 @@
         </w:tc>
         <w:tc>
           <w:tcPr>
-            <w:tcW w:type="dxa" w:w="4110"/>
+            <w:tcW w:type="dxa" w:w="4060"/>
             <w:tcMar>
               <w:top w:w="80" w:type="dxa"/>
               <w:start w:w="120" w:type="dxa"/>
@@ -978,7 +978,7 @@
             </w:pPr>
             <w:r>
               <w:rPr>
-                <w:rFonts w:ascii="Tahoma" w:hAnsi="Tahoma" w:eastAsia="Tahoma"/>
+                <w:rFonts w:ascii="Thonburi" w:hAnsi="Thonburi" w:eastAsia="Thonburi"/>
                 <w:color w:val="172033"/>
                 <w:sz w:val="18"/>
               </w:rPr>
@@ -990,7 +990,7 @@
       <w:tr>
         <w:tc>
           <w:tcPr>
-            <w:tcW w:type="dxa" w:w="1700"/>
+            <w:tcW w:type="dxa" w:w="1600"/>
             <w:shd w:fill="F8FAFC"/>
             <w:tcMar>
               <w:top w:w="80" w:type="dxa"/>
@@ -1007,7 +1007,7 @@
             </w:pPr>
             <w:r>
               <w:rPr>
-                <w:rFonts w:ascii="Tahoma" w:hAnsi="Tahoma" w:eastAsia="Tahoma"/>
+                <w:rFonts w:ascii="Thonburi" w:hAnsi="Thonburi" w:eastAsia="Thonburi"/>
                 <w:color w:val="172033"/>
                 <w:sz w:val="18"/>
               </w:rPr>
@@ -1017,7 +1017,7 @@
         </w:tc>
         <w:tc>
           <w:tcPr>
-            <w:tcW w:type="dxa" w:w="800"/>
+            <w:tcW w:type="dxa" w:w="1100"/>
             <w:shd w:fill="F8FAFC"/>
             <w:tcMar>
               <w:top w:w="80" w:type="dxa"/>
@@ -1034,7 +1034,7 @@
             </w:pPr>
             <w:r>
               <w:rPr>
-                <w:rFonts w:ascii="Tahoma" w:hAnsi="Tahoma" w:eastAsia="Tahoma"/>
+                <w:rFonts w:ascii="Thonburi" w:hAnsi="Thonburi" w:eastAsia="Thonburi"/>
                 <w:color w:val="172033"/>
                 <w:sz w:val="18"/>
               </w:rPr>
@@ -1044,7 +1044,7 @@
         </w:tc>
         <w:tc>
           <w:tcPr>
-            <w:tcW w:type="dxa" w:w="2750"/>
+            <w:tcW w:type="dxa" w:w="2600"/>
             <w:shd w:fill="F8FAFC"/>
             <w:tcMar>
               <w:top w:w="80" w:type="dxa"/>
@@ -1061,7 +1061,7 @@
             </w:pPr>
             <w:r>
               <w:rPr>
-                <w:rFonts w:ascii="Tahoma" w:hAnsi="Tahoma" w:eastAsia="Tahoma"/>
+                <w:rFonts w:ascii="Thonburi" w:hAnsi="Thonburi" w:eastAsia="Thonburi"/>
                 <w:color w:val="172033"/>
                 <w:sz w:val="18"/>
               </w:rPr>
@@ -1071,7 +1071,7 @@
         </w:tc>
         <w:tc>
           <w:tcPr>
-            <w:tcW w:type="dxa" w:w="4110"/>
+            <w:tcW w:type="dxa" w:w="4060"/>
             <w:shd w:fill="F8FAFC"/>
             <w:tcMar>
               <w:top w:w="80" w:type="dxa"/>
@@ -1088,7 +1088,7 @@
             </w:pPr>
             <w:r>
               <w:rPr>
-                <w:rFonts w:ascii="Tahoma" w:hAnsi="Tahoma" w:eastAsia="Tahoma"/>
+                <w:rFonts w:ascii="Thonburi" w:hAnsi="Thonburi" w:eastAsia="Thonburi"/>
                 <w:color w:val="172033"/>
                 <w:sz w:val="18"/>
               </w:rPr>
@@ -1100,7 +1100,7 @@
       <w:tr>
         <w:tc>
           <w:tcPr>
-            <w:tcW w:type="dxa" w:w="1700"/>
+            <w:tcW w:type="dxa" w:w="1600"/>
             <w:tcMar>
               <w:top w:w="80" w:type="dxa"/>
               <w:start w:w="120" w:type="dxa"/>
@@ -1116,7 +1116,7 @@
             </w:pPr>
             <w:r>
               <w:rPr>
-                <w:rFonts w:ascii="Tahoma" w:hAnsi="Tahoma" w:eastAsia="Tahoma"/>
+                <w:rFonts w:ascii="Thonburi" w:hAnsi="Thonburi" w:eastAsia="Thonburi"/>
                 <w:color w:val="172033"/>
                 <w:sz w:val="18"/>
               </w:rPr>
@@ -1126,7 +1126,7 @@
         </w:tc>
         <w:tc>
           <w:tcPr>
-            <w:tcW w:type="dxa" w:w="800"/>
+            <w:tcW w:type="dxa" w:w="1100"/>
             <w:tcMar>
               <w:top w:w="80" w:type="dxa"/>
               <w:start w:w="120" w:type="dxa"/>
@@ -1142,7 +1142,7 @@
             </w:pPr>
             <w:r>
               <w:rPr>
-                <w:rFonts w:ascii="Tahoma" w:hAnsi="Tahoma" w:eastAsia="Tahoma"/>
+                <w:rFonts w:ascii="Thonburi" w:hAnsi="Thonburi" w:eastAsia="Thonburi"/>
                 <w:color w:val="172033"/>
                 <w:sz w:val="18"/>
               </w:rPr>
@@ -1152,7 +1152,7 @@
         </w:tc>
         <w:tc>
           <w:tcPr>
-            <w:tcW w:type="dxa" w:w="2750"/>
+            <w:tcW w:type="dxa" w:w="2600"/>
             <w:tcMar>
               <w:top w:w="80" w:type="dxa"/>
               <w:start w:w="120" w:type="dxa"/>
@@ -1168,7 +1168,7 @@
             </w:pPr>
             <w:r>
               <w:rPr>
-                <w:rFonts w:ascii="Tahoma" w:hAnsi="Tahoma" w:eastAsia="Tahoma"/>
+                <w:rFonts w:ascii="Thonburi" w:hAnsi="Thonburi" w:eastAsia="Thonburi"/>
                 <w:color w:val="172033"/>
                 <w:sz w:val="18"/>
               </w:rPr>
@@ -1178,7 +1178,7 @@
         </w:tc>
         <w:tc>
           <w:tcPr>
-            <w:tcW w:type="dxa" w:w="4110"/>
+            <w:tcW w:type="dxa" w:w="4060"/>
             <w:tcMar>
               <w:top w:w="80" w:type="dxa"/>
               <w:start w:w="120" w:type="dxa"/>
@@ -1194,7 +1194,7 @@
             </w:pPr>
             <w:r>
               <w:rPr>
-                <w:rFonts w:ascii="Tahoma" w:hAnsi="Tahoma" w:eastAsia="Tahoma"/>
+                <w:rFonts w:ascii="Thonburi" w:hAnsi="Thonburi" w:eastAsia="Thonburi"/>
                 <w:color w:val="172033"/>
                 <w:sz w:val="18"/>
               </w:rPr>
@@ -1206,7 +1206,7 @@
       <w:tr>
         <w:tc>
           <w:tcPr>
-            <w:tcW w:type="dxa" w:w="1700"/>
+            <w:tcW w:type="dxa" w:w="1600"/>
             <w:shd w:fill="F8FAFC"/>
             <w:tcMar>
               <w:top w:w="80" w:type="dxa"/>
@@ -1223,7 +1223,7 @@
             </w:pPr>
             <w:r>
               <w:rPr>
-                <w:rFonts w:ascii="Tahoma" w:hAnsi="Tahoma" w:eastAsia="Tahoma"/>
+                <w:rFonts w:ascii="Thonburi" w:hAnsi="Thonburi" w:eastAsia="Thonburi"/>
                 <w:color w:val="172033"/>
                 <w:sz w:val="18"/>
               </w:rPr>
@@ -1233,7 +1233,7 @@
         </w:tc>
         <w:tc>
           <w:tcPr>
-            <w:tcW w:type="dxa" w:w="800"/>
+            <w:tcW w:type="dxa" w:w="1100"/>
             <w:shd w:fill="F8FAFC"/>
             <w:tcMar>
               <w:top w:w="80" w:type="dxa"/>
@@ -1250,7 +1250,7 @@
             </w:pPr>
             <w:r>
               <w:rPr>
-                <w:rFonts w:ascii="Tahoma" w:hAnsi="Tahoma" w:eastAsia="Tahoma"/>
+                <w:rFonts w:ascii="Thonburi" w:hAnsi="Thonburi" w:eastAsia="Thonburi"/>
                 <w:color w:val="172033"/>
                 <w:sz w:val="18"/>
               </w:rPr>
@@ -1260,7 +1260,7 @@
         </w:tc>
         <w:tc>
           <w:tcPr>
-            <w:tcW w:type="dxa" w:w="2750"/>
+            <w:tcW w:type="dxa" w:w="2600"/>
             <w:shd w:fill="F8FAFC"/>
             <w:tcMar>
               <w:top w:w="80" w:type="dxa"/>
@@ -1277,7 +1277,7 @@
             </w:pPr>
             <w:r>
               <w:rPr>
-                <w:rFonts w:ascii="Tahoma" w:hAnsi="Tahoma" w:eastAsia="Tahoma"/>
+                <w:rFonts w:ascii="Thonburi" w:hAnsi="Thonburi" w:eastAsia="Thonburi"/>
                 <w:color w:val="172033"/>
                 <w:sz w:val="18"/>
               </w:rPr>
@@ -1287,7 +1287,7 @@
         </w:tc>
         <w:tc>
           <w:tcPr>
-            <w:tcW w:type="dxa" w:w="4110"/>
+            <w:tcW w:type="dxa" w:w="4060"/>
             <w:shd w:fill="F8FAFC"/>
             <w:tcMar>
               <w:top w:w="80" w:type="dxa"/>
@@ -1304,7 +1304,7 @@
             </w:pPr>
             <w:r>
               <w:rPr>
-                <w:rFonts w:ascii="Tahoma" w:hAnsi="Tahoma" w:eastAsia="Tahoma"/>
+                <w:rFonts w:ascii="Thonburi" w:hAnsi="Thonburi" w:eastAsia="Thonburi"/>
                 <w:color w:val="172033"/>
                 <w:sz w:val="18"/>
               </w:rPr>
@@ -1316,7 +1316,7 @@
       <w:tr>
         <w:tc>
           <w:tcPr>
-            <w:tcW w:type="dxa" w:w="1700"/>
+            <w:tcW w:type="dxa" w:w="1600"/>
             <w:tcMar>
               <w:top w:w="80" w:type="dxa"/>
               <w:start w:w="120" w:type="dxa"/>
@@ -1332,7 +1332,7 @@
             </w:pPr>
             <w:r>
               <w:rPr>
-                <w:rFonts w:ascii="Tahoma" w:hAnsi="Tahoma" w:eastAsia="Tahoma"/>
+                <w:rFonts w:ascii="Thonburi" w:hAnsi="Thonburi" w:eastAsia="Thonburi"/>
                 <w:color w:val="172033"/>
                 <w:sz w:val="18"/>
               </w:rPr>
@@ -1342,7 +1342,7 @@
         </w:tc>
         <w:tc>
           <w:tcPr>
-            <w:tcW w:type="dxa" w:w="800"/>
+            <w:tcW w:type="dxa" w:w="1100"/>
             <w:tcMar>
               <w:top w:w="80" w:type="dxa"/>
               <w:start w:w="120" w:type="dxa"/>
@@ -1358,7 +1358,7 @@
             </w:pPr>
             <w:r>
               <w:rPr>
-                <w:rFonts w:ascii="Tahoma" w:hAnsi="Tahoma" w:eastAsia="Tahoma"/>
+                <w:rFonts w:ascii="Thonburi" w:hAnsi="Thonburi" w:eastAsia="Thonburi"/>
                 <w:color w:val="172033"/>
                 <w:sz w:val="18"/>
               </w:rPr>
@@ -1368,7 +1368,7 @@
         </w:tc>
         <w:tc>
           <w:tcPr>
-            <w:tcW w:type="dxa" w:w="2750"/>
+            <w:tcW w:type="dxa" w:w="2600"/>
             <w:tcMar>
               <w:top w:w="80" w:type="dxa"/>
               <w:start w:w="120" w:type="dxa"/>
@@ -1384,7 +1384,7 @@
             </w:pPr>
             <w:r>
               <w:rPr>
-                <w:rFonts w:ascii="Tahoma" w:hAnsi="Tahoma" w:eastAsia="Tahoma"/>
+                <w:rFonts w:ascii="Thonburi" w:hAnsi="Thonburi" w:eastAsia="Thonburi"/>
                 <w:color w:val="172033"/>
                 <w:sz w:val="18"/>
               </w:rPr>
@@ -1394,7 +1394,7 @@
         </w:tc>
         <w:tc>
           <w:tcPr>
-            <w:tcW w:type="dxa" w:w="4110"/>
+            <w:tcW w:type="dxa" w:w="4060"/>
             <w:tcMar>
               <w:top w:w="80" w:type="dxa"/>
               <w:start w:w="120" w:type="dxa"/>
@@ -1410,7 +1410,7 @@
             </w:pPr>
             <w:r>
               <w:rPr>
-                <w:rFonts w:ascii="Tahoma" w:hAnsi="Tahoma" w:eastAsia="Tahoma"/>
+                <w:rFonts w:ascii="Thonburi" w:hAnsi="Thonburi" w:eastAsia="Thonburi"/>
                 <w:color w:val="172033"/>
                 <w:sz w:val="18"/>
               </w:rPr>
@@ -1422,7 +1422,7 @@
       <w:tr>
         <w:tc>
           <w:tcPr>
-            <w:tcW w:type="dxa" w:w="1700"/>
+            <w:tcW w:type="dxa" w:w="1600"/>
             <w:shd w:fill="F8FAFC"/>
             <w:tcMar>
               <w:top w:w="80" w:type="dxa"/>
@@ -1439,7 +1439,7 @@
             </w:pPr>
             <w:r>
               <w:rPr>
-                <w:rFonts w:ascii="Tahoma" w:hAnsi="Tahoma" w:eastAsia="Tahoma"/>
+                <w:rFonts w:ascii="Thonburi" w:hAnsi="Thonburi" w:eastAsia="Thonburi"/>
                 <w:color w:val="172033"/>
                 <w:sz w:val="18"/>
               </w:rPr>
@@ -1449,7 +1449,7 @@
         </w:tc>
         <w:tc>
           <w:tcPr>
-            <w:tcW w:type="dxa" w:w="800"/>
+            <w:tcW w:type="dxa" w:w="1100"/>
             <w:shd w:fill="F8FAFC"/>
             <w:tcMar>
               <w:top w:w="80" w:type="dxa"/>
@@ -1466,7 +1466,7 @@
             </w:pPr>
             <w:r>
               <w:rPr>
-                <w:rFonts w:ascii="Tahoma" w:hAnsi="Tahoma" w:eastAsia="Tahoma"/>
+                <w:rFonts w:ascii="Thonburi" w:hAnsi="Thonburi" w:eastAsia="Thonburi"/>
                 <w:color w:val="172033"/>
                 <w:sz w:val="18"/>
               </w:rPr>
@@ -1476,7 +1476,7 @@
         </w:tc>
         <w:tc>
           <w:tcPr>
-            <w:tcW w:type="dxa" w:w="2750"/>
+            <w:tcW w:type="dxa" w:w="2600"/>
             <w:shd w:fill="F8FAFC"/>
             <w:tcMar>
               <w:top w:w="80" w:type="dxa"/>
@@ -1493,7 +1493,7 @@
             </w:pPr>
             <w:r>
               <w:rPr>
-                <w:rFonts w:ascii="Tahoma" w:hAnsi="Tahoma" w:eastAsia="Tahoma"/>
+                <w:rFonts w:ascii="Thonburi" w:hAnsi="Thonburi" w:eastAsia="Thonburi"/>
                 <w:color w:val="172033"/>
                 <w:sz w:val="18"/>
               </w:rPr>
@@ -1503,7 +1503,7 @@
         </w:tc>
         <w:tc>
           <w:tcPr>
-            <w:tcW w:type="dxa" w:w="4110"/>
+            <w:tcW w:type="dxa" w:w="4060"/>
             <w:shd w:fill="F8FAFC"/>
             <w:tcMar>
               <w:top w:w="80" w:type="dxa"/>
@@ -1520,7 +1520,7 @@
             </w:pPr>
             <w:r>
               <w:rPr>
-                <w:rFonts w:ascii="Tahoma" w:hAnsi="Tahoma" w:eastAsia="Tahoma"/>
+                <w:rFonts w:ascii="Thonburi" w:hAnsi="Thonburi" w:eastAsia="Thonburi"/>
                 <w:color w:val="172033"/>
                 <w:sz w:val="18"/>
               </w:rPr>
@@ -1532,7 +1532,7 @@
       <w:tr>
         <w:tc>
           <w:tcPr>
-            <w:tcW w:type="dxa" w:w="1700"/>
+            <w:tcW w:type="dxa" w:w="1600"/>
             <w:tcMar>
               <w:top w:w="80" w:type="dxa"/>
               <w:start w:w="120" w:type="dxa"/>
@@ -1548,7 +1548,7 @@
             </w:pPr>
             <w:r>
               <w:rPr>
-                <w:rFonts w:ascii="Tahoma" w:hAnsi="Tahoma" w:eastAsia="Tahoma"/>
+                <w:rFonts w:ascii="Thonburi" w:hAnsi="Thonburi" w:eastAsia="Thonburi"/>
                 <w:color w:val="172033"/>
                 <w:sz w:val="18"/>
               </w:rPr>
@@ -1558,7 +1558,7 @@
         </w:tc>
         <w:tc>
           <w:tcPr>
-            <w:tcW w:type="dxa" w:w="800"/>
+            <w:tcW w:type="dxa" w:w="1100"/>
             <w:tcMar>
               <w:top w:w="80" w:type="dxa"/>
               <w:start w:w="120" w:type="dxa"/>
@@ -1574,7 +1574,7 @@
             </w:pPr>
             <w:r>
               <w:rPr>
-                <w:rFonts w:ascii="Tahoma" w:hAnsi="Tahoma" w:eastAsia="Tahoma"/>
+                <w:rFonts w:ascii="Thonburi" w:hAnsi="Thonburi" w:eastAsia="Thonburi"/>
                 <w:color w:val="172033"/>
                 <w:sz w:val="18"/>
               </w:rPr>
@@ -1584,7 +1584,7 @@
         </w:tc>
         <w:tc>
           <w:tcPr>
-            <w:tcW w:type="dxa" w:w="2750"/>
+            <w:tcW w:type="dxa" w:w="2600"/>
             <w:tcMar>
               <w:top w:w="80" w:type="dxa"/>
               <w:start w:w="120" w:type="dxa"/>
@@ -1600,7 +1600,7 @@
             </w:pPr>
             <w:r>
               <w:rPr>
-                <w:rFonts w:ascii="Tahoma" w:hAnsi="Tahoma" w:eastAsia="Tahoma"/>
+                <w:rFonts w:ascii="Thonburi" w:hAnsi="Thonburi" w:eastAsia="Thonburi"/>
                 <w:color w:val="172033"/>
                 <w:sz w:val="18"/>
               </w:rPr>
@@ -1610,7 +1610,7 @@
         </w:tc>
         <w:tc>
           <w:tcPr>
-            <w:tcW w:type="dxa" w:w="4110"/>
+            <w:tcW w:type="dxa" w:w="4060"/>
             <w:tcMar>
               <w:top w:w="80" w:type="dxa"/>
               <w:start w:w="120" w:type="dxa"/>
@@ -1626,7 +1626,7 @@
             </w:pPr>
             <w:r>
               <w:rPr>
-                <w:rFonts w:ascii="Tahoma" w:hAnsi="Tahoma" w:eastAsia="Tahoma"/>
+                <w:rFonts w:ascii="Thonburi" w:hAnsi="Thonburi" w:eastAsia="Thonburi"/>
                 <w:color w:val="172033"/>
                 <w:sz w:val="18"/>
               </w:rPr>
@@ -1653,7 +1653,7 @@
       </w:pPr>
       <w:r>
         <w:rPr>
-          <w:rFonts w:ascii="Tahoma" w:hAnsi="Tahoma" w:eastAsia="Tahoma"/>
+          <w:rFonts w:ascii="Thonburi" w:hAnsi="Thonburi" w:eastAsia="Thonburi"/>
           <w:b/>
           <w:color w:val="0072CE"/>
           <w:sz w:val="21"/>
@@ -1662,11 +1662,16 @@
       </w:r>
       <w:r>
         <w:rPr>
-          <w:rFonts w:ascii="Tahoma" w:hAnsi="Tahoma" w:eastAsia="Tahoma"/>
+          <w:rFonts w:ascii="Thonburi" w:hAnsi="Thonburi" w:eastAsia="Thonburi"/>
           <w:color w:val="172033"/>
           <w:sz w:val="21"/>
         </w:rPr>
         <w:t>กล้องสาธิตเดิมยังคงใช้ภาพเดิมของระบบ และจะไม่ดึงภาพจาก Google Drive จนกว่าจะมีการระบุ Google Drive URL ให้กล้องนั้น</w:t>
+      </w:r>
+    </w:p>
+    <w:p>
+      <w:r>
+        <w:br w:type="page"/>
       </w:r>
     </w:p>
     <w:p>
@@ -1683,12 +1688,12 @@
         <w:spacing w:before="0" w:after="80" w:line="300" w:lineRule="auto"/>
         <w:numPr>
           <w:ilvl w:val="0"/>
-          <w:numId w:val="41"/>
+          <w:numId w:val="44"/>
         </w:numPr>
       </w:pPr>
       <w:r>
         <w:rPr>
-          <w:rFonts w:ascii="Tahoma" w:hAnsi="Tahoma" w:eastAsia="Tahoma"/>
+          <w:rFonts w:ascii="Thonburi" w:hAnsi="Thonburi" w:eastAsia="Thonburi"/>
           <w:b/>
           <w:color w:val="0B2545"/>
           <w:sz w:val="22"/>
@@ -1697,7 +1702,7 @@
       </w:r>
       <w:r>
         <w:rPr>
-          <w:rFonts w:ascii="Tahoma" w:hAnsi="Tahoma" w:eastAsia="Tahoma"/>
+          <w:rFonts w:ascii="Thonburi" w:hAnsi="Thonburi" w:eastAsia="Thonburi"/>
           <w:color w:val="172033"/>
           <w:sz w:val="22"/>
         </w:rPr>
@@ -1710,12 +1715,12 @@
         <w:spacing w:before="0" w:after="80" w:line="300" w:lineRule="auto"/>
         <w:numPr>
           <w:ilvl w:val="0"/>
-          <w:numId w:val="41"/>
+          <w:numId w:val="44"/>
         </w:numPr>
       </w:pPr>
       <w:r>
         <w:rPr>
-          <w:rFonts w:ascii="Tahoma" w:hAnsi="Tahoma" w:eastAsia="Tahoma"/>
+          <w:rFonts w:ascii="Thonburi" w:hAnsi="Thonburi" w:eastAsia="Thonburi"/>
           <w:b/>
           <w:color w:val="0B2545"/>
           <w:sz w:val="22"/>
@@ -1724,7 +1729,7 @@
       </w:r>
       <w:r>
         <w:rPr>
-          <w:rFonts w:ascii="Tahoma" w:hAnsi="Tahoma" w:eastAsia="Tahoma"/>
+          <w:rFonts w:ascii="Thonburi" w:hAnsi="Thonburi" w:eastAsia="Thonburi"/>
           <w:color w:val="172033"/>
           <w:sz w:val="22"/>
         </w:rPr>
@@ -1737,12 +1742,12 @@
         <w:spacing w:before="0" w:after="80" w:line="300" w:lineRule="auto"/>
         <w:numPr>
           <w:ilvl w:val="0"/>
-          <w:numId w:val="41"/>
+          <w:numId w:val="44"/>
         </w:numPr>
       </w:pPr>
       <w:r>
         <w:rPr>
-          <w:rFonts w:ascii="Tahoma" w:hAnsi="Tahoma" w:eastAsia="Tahoma"/>
+          <w:rFonts w:ascii="Thonburi" w:hAnsi="Thonburi" w:eastAsia="Thonburi"/>
           <w:b/>
           <w:color w:val="0B2545"/>
           <w:sz w:val="22"/>
@@ -1751,7 +1756,7 @@
       </w:r>
       <w:r>
         <w:rPr>
-          <w:rFonts w:ascii="Tahoma" w:hAnsi="Tahoma" w:eastAsia="Tahoma"/>
+          <w:rFonts w:ascii="Thonburi" w:hAnsi="Thonburi" w:eastAsia="Thonburi"/>
           <w:color w:val="172033"/>
           <w:sz w:val="22"/>
         </w:rPr>
@@ -1764,12 +1769,12 @@
         <w:spacing w:before="0" w:after="80" w:line="300" w:lineRule="auto"/>
         <w:numPr>
           <w:ilvl w:val="0"/>
-          <w:numId w:val="41"/>
+          <w:numId w:val="44"/>
         </w:numPr>
       </w:pPr>
       <w:r>
         <w:rPr>
-          <w:rFonts w:ascii="Tahoma" w:hAnsi="Tahoma" w:eastAsia="Tahoma"/>
+          <w:rFonts w:ascii="Thonburi" w:hAnsi="Thonburi" w:eastAsia="Thonburi"/>
           <w:b/>
           <w:color w:val="0B2545"/>
           <w:sz w:val="22"/>
@@ -1778,7 +1783,7 @@
       </w:r>
       <w:r>
         <w:rPr>
-          <w:rFonts w:ascii="Tahoma" w:hAnsi="Tahoma" w:eastAsia="Tahoma"/>
+          <w:rFonts w:ascii="Thonburi" w:hAnsi="Thonburi" w:eastAsia="Thonburi"/>
           <w:color w:val="172033"/>
           <w:sz w:val="22"/>
         </w:rPr>
@@ -1797,7 +1802,7 @@
       </w:pPr>
       <w:r>
         <w:rPr>
-          <w:rFonts w:ascii="Tahoma" w:hAnsi="Tahoma" w:eastAsia="Tahoma"/>
+          <w:rFonts w:ascii="Thonburi" w:hAnsi="Thonburi" w:eastAsia="Thonburi"/>
           <w:b/>
           <w:color w:val="0072CE"/>
           <w:sz w:val="21"/>
@@ -1806,7 +1811,7 @@
       </w:r>
       <w:r>
         <w:rPr>
-          <w:rFonts w:ascii="Tahoma" w:hAnsi="Tahoma" w:eastAsia="Tahoma"/>
+          <w:rFonts w:ascii="Thonburi" w:hAnsi="Thonburi" w:eastAsia="Thonburi"/>
           <w:color w:val="172033"/>
           <w:sz w:val="21"/>
         </w:rPr>
@@ -1827,12 +1832,12 @@
         <w:spacing w:before="0" w:after="80" w:line="300" w:lineRule="auto"/>
         <w:numPr>
           <w:ilvl w:val="0"/>
-          <w:numId w:val="41"/>
+          <w:numId w:val="45"/>
         </w:numPr>
       </w:pPr>
       <w:r>
         <w:rPr>
-          <w:rFonts w:ascii="Tahoma" w:hAnsi="Tahoma" w:eastAsia="Tahoma"/>
+          <w:rFonts w:ascii="Thonburi" w:hAnsi="Thonburi" w:eastAsia="Thonburi"/>
           <w:b/>
           <w:color w:val="0B2545"/>
           <w:sz w:val="22"/>
@@ -1841,7 +1846,7 @@
       </w:r>
       <w:r>
         <w:rPr>
-          <w:rFonts w:ascii="Tahoma" w:hAnsi="Tahoma" w:eastAsia="Tahoma"/>
+          <w:rFonts w:ascii="Thonburi" w:hAnsi="Thonburi" w:eastAsia="Thonburi"/>
           <w:color w:val="172033"/>
           <w:sz w:val="22"/>
         </w:rPr>
@@ -1854,12 +1859,12 @@
         <w:spacing w:before="0" w:after="80" w:line="300" w:lineRule="auto"/>
         <w:numPr>
           <w:ilvl w:val="0"/>
-          <w:numId w:val="41"/>
+          <w:numId w:val="45"/>
         </w:numPr>
       </w:pPr>
       <w:r>
         <w:rPr>
-          <w:rFonts w:ascii="Tahoma" w:hAnsi="Tahoma" w:eastAsia="Tahoma"/>
+          <w:rFonts w:ascii="Thonburi" w:hAnsi="Thonburi" w:eastAsia="Thonburi"/>
           <w:b/>
           <w:color w:val="0B2545"/>
           <w:sz w:val="22"/>
@@ -1868,7 +1873,7 @@
       </w:r>
       <w:r>
         <w:rPr>
-          <w:rFonts w:ascii="Tahoma" w:hAnsi="Tahoma" w:eastAsia="Tahoma"/>
+          <w:rFonts w:ascii="Thonburi" w:hAnsi="Thonburi" w:eastAsia="Thonburi"/>
           <w:color w:val="172033"/>
           <w:sz w:val="22"/>
         </w:rPr>
@@ -1881,12 +1886,12 @@
         <w:spacing w:before="0" w:after="80" w:line="300" w:lineRule="auto"/>
         <w:numPr>
           <w:ilvl w:val="0"/>
-          <w:numId w:val="41"/>
+          <w:numId w:val="45"/>
         </w:numPr>
       </w:pPr>
       <w:r>
         <w:rPr>
-          <w:rFonts w:ascii="Tahoma" w:hAnsi="Tahoma" w:eastAsia="Tahoma"/>
+          <w:rFonts w:ascii="Thonburi" w:hAnsi="Thonburi" w:eastAsia="Thonburi"/>
           <w:b/>
           <w:color w:val="0B2545"/>
           <w:sz w:val="22"/>
@@ -1895,7 +1900,7 @@
       </w:r>
       <w:r>
         <w:rPr>
-          <w:rFonts w:ascii="Tahoma" w:hAnsi="Tahoma" w:eastAsia="Tahoma"/>
+          <w:rFonts w:ascii="Thonburi" w:hAnsi="Thonburi" w:eastAsia="Thonburi"/>
           <w:color w:val="172033"/>
           <w:sz w:val="22"/>
         </w:rPr>
@@ -1908,12 +1913,12 @@
         <w:spacing w:before="0" w:after="80" w:line="300" w:lineRule="auto"/>
         <w:numPr>
           <w:ilvl w:val="0"/>
-          <w:numId w:val="41"/>
+          <w:numId w:val="45"/>
         </w:numPr>
       </w:pPr>
       <w:r>
         <w:rPr>
-          <w:rFonts w:ascii="Tahoma" w:hAnsi="Tahoma" w:eastAsia="Tahoma"/>
+          <w:rFonts w:ascii="Thonburi" w:hAnsi="Thonburi" w:eastAsia="Thonburi"/>
           <w:b/>
           <w:color w:val="0B2545"/>
           <w:sz w:val="22"/>
@@ -1922,7 +1927,7 @@
       </w:r>
       <w:r>
         <w:rPr>
-          <w:rFonts w:ascii="Tahoma" w:hAnsi="Tahoma" w:eastAsia="Tahoma"/>
+          <w:rFonts w:ascii="Thonburi" w:hAnsi="Thonburi" w:eastAsia="Thonburi"/>
           <w:color w:val="172033"/>
           <w:sz w:val="22"/>
         </w:rPr>
@@ -1977,7 +1982,7 @@
             </w:pPr>
             <w:r>
               <w:rPr>
-                <w:rFonts w:ascii="Tahoma" w:hAnsi="Tahoma" w:eastAsia="Tahoma"/>
+                <w:rFonts w:ascii="Thonburi" w:hAnsi="Thonburi" w:eastAsia="Thonburi"/>
                 <w:b/>
                 <w:color w:val="FFFFFF"/>
                 <w:sz w:val="19"/>
@@ -2005,7 +2010,7 @@
             </w:pPr>
             <w:r>
               <w:rPr>
-                <w:rFonts w:ascii="Tahoma" w:hAnsi="Tahoma" w:eastAsia="Tahoma"/>
+                <w:rFonts w:ascii="Thonburi" w:hAnsi="Thonburi" w:eastAsia="Thonburi"/>
                 <w:b/>
                 <w:color w:val="FFFFFF"/>
                 <w:sz w:val="19"/>
@@ -2034,7 +2039,7 @@
             </w:pPr>
             <w:r>
               <w:rPr>
-                <w:rFonts w:ascii="Tahoma" w:hAnsi="Tahoma" w:eastAsia="Tahoma"/>
+                <w:rFonts w:ascii="Thonburi" w:hAnsi="Thonburi" w:eastAsia="Thonburi"/>
                 <w:color w:val="172033"/>
                 <w:sz w:val="18"/>
               </w:rPr>
@@ -2060,7 +2065,7 @@
             </w:pPr>
             <w:r>
               <w:rPr>
-                <w:rFonts w:ascii="Tahoma" w:hAnsi="Tahoma" w:eastAsia="Tahoma"/>
+                <w:rFonts w:ascii="Thonburi" w:hAnsi="Thonburi" w:eastAsia="Thonburi"/>
                 <w:color w:val="172033"/>
                 <w:sz w:val="18"/>
               </w:rPr>
@@ -2089,7 +2094,7 @@
             </w:pPr>
             <w:r>
               <w:rPr>
-                <w:rFonts w:ascii="Tahoma" w:hAnsi="Tahoma" w:eastAsia="Tahoma"/>
+                <w:rFonts w:ascii="Thonburi" w:hAnsi="Thonburi" w:eastAsia="Thonburi"/>
                 <w:color w:val="172033"/>
                 <w:sz w:val="18"/>
               </w:rPr>
@@ -2116,7 +2121,7 @@
             </w:pPr>
             <w:r>
               <w:rPr>
-                <w:rFonts w:ascii="Tahoma" w:hAnsi="Tahoma" w:eastAsia="Tahoma"/>
+                <w:rFonts w:ascii="Thonburi" w:hAnsi="Thonburi" w:eastAsia="Thonburi"/>
                 <w:color w:val="172033"/>
                 <w:sz w:val="18"/>
               </w:rPr>
@@ -2144,7 +2149,7 @@
             </w:pPr>
             <w:r>
               <w:rPr>
-                <w:rFonts w:ascii="Tahoma" w:hAnsi="Tahoma" w:eastAsia="Tahoma"/>
+                <w:rFonts w:ascii="Thonburi" w:hAnsi="Thonburi" w:eastAsia="Thonburi"/>
                 <w:color w:val="172033"/>
                 <w:sz w:val="18"/>
               </w:rPr>
@@ -2170,7 +2175,7 @@
             </w:pPr>
             <w:r>
               <w:rPr>
-                <w:rFonts w:ascii="Tahoma" w:hAnsi="Tahoma" w:eastAsia="Tahoma"/>
+                <w:rFonts w:ascii="Thonburi" w:hAnsi="Thonburi" w:eastAsia="Thonburi"/>
                 <w:color w:val="172033"/>
                 <w:sz w:val="18"/>
               </w:rPr>
@@ -2199,7 +2204,7 @@
             </w:pPr>
             <w:r>
               <w:rPr>
-                <w:rFonts w:ascii="Tahoma" w:hAnsi="Tahoma" w:eastAsia="Tahoma"/>
+                <w:rFonts w:ascii="Thonburi" w:hAnsi="Thonburi" w:eastAsia="Thonburi"/>
                 <w:color w:val="172033"/>
                 <w:sz w:val="18"/>
               </w:rPr>
@@ -2226,7 +2231,7 @@
             </w:pPr>
             <w:r>
               <w:rPr>
-                <w:rFonts w:ascii="Tahoma" w:hAnsi="Tahoma" w:eastAsia="Tahoma"/>
+                <w:rFonts w:ascii="Thonburi" w:hAnsi="Thonburi" w:eastAsia="Thonburi"/>
                 <w:color w:val="172033"/>
                 <w:sz w:val="18"/>
               </w:rPr>
@@ -2254,7 +2259,7 @@
             </w:pPr>
             <w:r>
               <w:rPr>
-                <w:rFonts w:ascii="Tahoma" w:hAnsi="Tahoma" w:eastAsia="Tahoma"/>
+                <w:rFonts w:ascii="Thonburi" w:hAnsi="Thonburi" w:eastAsia="Thonburi"/>
                 <w:color w:val="172033"/>
                 <w:sz w:val="18"/>
               </w:rPr>
@@ -2280,7 +2285,7 @@
             </w:pPr>
             <w:r>
               <w:rPr>
-                <w:rFonts w:ascii="Tahoma" w:hAnsi="Tahoma" w:eastAsia="Tahoma"/>
+                <w:rFonts w:ascii="Thonburi" w:hAnsi="Thonburi" w:eastAsia="Thonburi"/>
                 <w:color w:val="172033"/>
                 <w:sz w:val="18"/>
               </w:rPr>
@@ -2309,7 +2314,7 @@
             </w:pPr>
             <w:r>
               <w:rPr>
-                <w:rFonts w:ascii="Tahoma" w:hAnsi="Tahoma" w:eastAsia="Tahoma"/>
+                <w:rFonts w:ascii="Thonburi" w:hAnsi="Thonburi" w:eastAsia="Thonburi"/>
                 <w:color w:val="172033"/>
                 <w:sz w:val="18"/>
               </w:rPr>
@@ -2336,7 +2341,7 @@
             </w:pPr>
             <w:r>
               <w:rPr>
-                <w:rFonts w:ascii="Tahoma" w:hAnsi="Tahoma" w:eastAsia="Tahoma"/>
+                <w:rFonts w:ascii="Thonburi" w:hAnsi="Thonburi" w:eastAsia="Thonburi"/>
                 <w:color w:val="172033"/>
                 <w:sz w:val="18"/>
               </w:rPr>
@@ -2364,7 +2369,7 @@
             </w:pPr>
             <w:r>
               <w:rPr>
-                <w:rFonts w:ascii="Tahoma" w:hAnsi="Tahoma" w:eastAsia="Tahoma"/>
+                <w:rFonts w:ascii="Thonburi" w:hAnsi="Thonburi" w:eastAsia="Thonburi"/>
                 <w:color w:val="172033"/>
                 <w:sz w:val="18"/>
               </w:rPr>
@@ -2390,7 +2395,7 @@
             </w:pPr>
             <w:r>
               <w:rPr>
-                <w:rFonts w:ascii="Tahoma" w:hAnsi="Tahoma" w:eastAsia="Tahoma"/>
+                <w:rFonts w:ascii="Thonburi" w:hAnsi="Thonburi" w:eastAsia="Thonburi"/>
                 <w:color w:val="172033"/>
                 <w:sz w:val="18"/>
               </w:rPr>
@@ -2429,7 +2434,7 @@
       </w:r>
       <w:r>
         <w:rPr>
-          <w:rFonts w:ascii="Tahoma" w:hAnsi="Tahoma" w:eastAsia="Tahoma"/>
+          <w:rFonts w:ascii="Thonburi" w:hAnsi="Thonburi" w:eastAsia="Thonburi"/>
           <w:color w:val="172033"/>
           <w:sz w:val="22"/>
         </w:rPr>
@@ -2452,7 +2457,7 @@
       </w:r>
       <w:r>
         <w:rPr>
-          <w:rFonts w:ascii="Tahoma" w:hAnsi="Tahoma" w:eastAsia="Tahoma"/>
+          <w:rFonts w:ascii="Thonburi" w:hAnsi="Thonburi" w:eastAsia="Thonburi"/>
           <w:color w:val="172033"/>
           <w:sz w:val="22"/>
         </w:rPr>
@@ -2475,7 +2480,7 @@
       </w:r>
       <w:r>
         <w:rPr>
-          <w:rFonts w:ascii="Tahoma" w:hAnsi="Tahoma" w:eastAsia="Tahoma"/>
+          <w:rFonts w:ascii="Thonburi" w:hAnsi="Thonburi" w:eastAsia="Thonburi"/>
           <w:color w:val="172033"/>
           <w:sz w:val="22"/>
         </w:rPr>
@@ -2498,7 +2503,7 @@
       </w:r>
       <w:r>
         <w:rPr>
-          <w:rFonts w:ascii="Tahoma" w:hAnsi="Tahoma" w:eastAsia="Tahoma"/>
+          <w:rFonts w:ascii="Thonburi" w:hAnsi="Thonburi" w:eastAsia="Thonburi"/>
           <w:color w:val="172033"/>
           <w:sz w:val="22"/>
         </w:rPr>
@@ -2521,7 +2526,7 @@
       </w:r>
       <w:r>
         <w:rPr>
-          <w:rFonts w:ascii="Tahoma" w:hAnsi="Tahoma" w:eastAsia="Tahoma"/>
+          <w:rFonts w:ascii="Thonburi" w:hAnsi="Thonburi" w:eastAsia="Thonburi"/>
           <w:color w:val="172033"/>
           <w:sz w:val="22"/>
         </w:rPr>
@@ -2544,7 +2549,7 @@
       </w:r>
       <w:r>
         <w:rPr>
-          <w:rFonts w:ascii="Tahoma" w:hAnsi="Tahoma" w:eastAsia="Tahoma"/>
+          <w:rFonts w:ascii="Thonburi" w:hAnsi="Thonburi" w:eastAsia="Thonburi"/>
           <w:color w:val="172033"/>
           <w:sz w:val="22"/>
         </w:rPr>
@@ -2563,7 +2568,7 @@
       </w:pPr>
       <w:r>
         <w:rPr>
-          <w:rFonts w:ascii="Tahoma" w:hAnsi="Tahoma" w:eastAsia="Tahoma"/>
+          <w:rFonts w:ascii="Thonburi" w:hAnsi="Thonburi" w:eastAsia="Thonburi"/>
           <w:b/>
           <w:color w:val="9A7500"/>
           <w:sz w:val="21"/>
@@ -2572,7 +2577,7 @@
       </w:r>
       <w:r>
         <w:rPr>
-          <w:rFonts w:ascii="Tahoma" w:hAnsi="Tahoma" w:eastAsia="Tahoma"/>
+          <w:rFonts w:ascii="Thonburi" w:hAnsi="Thonburi" w:eastAsia="Thonburi"/>
           <w:color w:val="172033"/>
           <w:sz w:val="21"/>
         </w:rPr>
@@ -2587,7 +2592,7 @@
       </w:pPr>
       <w:r>
         <w:rPr>
-          <w:rFonts w:ascii="Tahoma" w:hAnsi="Tahoma" w:eastAsia="Tahoma"/>
+          <w:rFonts w:ascii="Thonburi" w:hAnsi="Thonburi" w:eastAsia="Thonburi"/>
           <w:b/>
           <w:color w:val="0B2545"/>
           <w:sz w:val="22"/>
@@ -2597,7 +2602,9 @@
     </w:p>
     <w:sectPr>
       <w:headerReference w:type="default" r:id="rId9"/>
-      <w:footerReference w:type="default" r:id="rId10"/>
+      <w:headerReference w:type="even" r:id="rId10"/>
+      <w:footerReference w:type="default" r:id="rId11"/>
+      <w:footerReference w:type="even" r:id="rId12"/>
       <w:pgSz w:w="12240" w:h="15840"/>
       <w:pgMar w:top="1440" w:right="1440" w:bottom="1440" w:left="1440" w:header="708" w:footer="708" w:gutter="0"/>
       <w:cols w:space="720"/>
@@ -2616,7 +2623,7 @@
     </w:pPr>
     <w:r>
       <w:rPr>
-        <w:rFonts w:ascii="Tahoma" w:hAnsi="Tahoma" w:eastAsia="Tahoma"/>
+        <w:rFonts w:ascii="Thonburi" w:hAnsi="Thonburi" w:eastAsia="Thonburi"/>
         <w:color w:val="596579"/>
         <w:sz w:val="17"/>
       </w:rPr>
@@ -2624,7 +2631,37 @@
     </w:r>
     <w:r>
       <w:rPr>
-        <w:rFonts w:ascii="Tahoma" w:hAnsi="Tahoma" w:eastAsia="Tahoma"/>
+        <w:rFonts w:ascii="Thonburi" w:hAnsi="Thonburi" w:eastAsia="Thonburi"/>
+        <w:color w:val="596579"/>
+        <w:sz w:val="17"/>
+      </w:rPr>
+      <w:fldChar w:fldCharType="begin"/>
+      <w:instrText xml:space="preserve"> PAGE </w:instrText>
+      <w:fldChar w:fldCharType="separate"/>
+      <w:fldChar w:fldCharType="end"/>
+    </w:r>
+  </w:p>
+</w:ftr>
+</file>
+
+<file path=word/footer2.xml><?xml version="1.0" encoding="utf-8"?>
+<w:ftr xmlns:m="http://schemas.openxmlformats.org/officeDocument/2006/math" xmlns:mc="http://schemas.openxmlformats.org/markup-compatibility/2006" xmlns:mo="http://schemas.microsoft.com/office/mac/office/2008/main" xmlns:mv="urn:schemas-microsoft-com:mac:vml" xmlns:o="urn:schemas-microsoft-com:office:office" xmlns:r="http://schemas.openxmlformats.org/officeDocument/2006/relationships" xmlns:v="urn:schemas-microsoft-com:vml" xmlns:w10="urn:schemas-microsoft-com:office:word" xmlns:w14="http://schemas.microsoft.com/office/word/2010/wordml" xmlns:w="http://schemas.openxmlformats.org/wordprocessingml/2006/main" xmlns:wne="http://schemas.microsoft.com/office/word/2006/wordml" xmlns:wp14="http://schemas.microsoft.com/office/word/2010/wordprocessingDrawing" xmlns:wp="http://schemas.openxmlformats.org/drawingml/2006/wordprocessingDrawing" xmlns:wpc="http://schemas.microsoft.com/office/word/2010/wordprocessingCanvas" xmlns:wpg="http://schemas.microsoft.com/office/word/2010/wordprocessingGroup" xmlns:wpi="http://schemas.microsoft.com/office/word/2010/wordprocessingInk" xmlns:wps="http://schemas.microsoft.com/office/word/2010/wordprocessingShape" mc:Ignorable="w14 wp14">
+  <w:p>
+    <w:pPr>
+      <w:pStyle w:val="Footer"/>
+      <w:jc w:val="right"/>
+    </w:pPr>
+    <w:r>
+      <w:rPr>
+        <w:rFonts w:ascii="Thonburi" w:hAnsi="Thonburi" w:eastAsia="Thonburi"/>
+        <w:color w:val="596579"/>
+        <w:sz w:val="17"/>
+      </w:rPr>
+      <w:t xml:space="preserve">หน้า </w:t>
+    </w:r>
+    <w:r>
+      <w:rPr>
+        <w:rFonts w:ascii="Thonburi" w:hAnsi="Thonburi" w:eastAsia="Thonburi"/>
         <w:color w:val="596579"/>
         <w:sz w:val="17"/>
       </w:rPr>
@@ -2651,7 +2688,32 @@
     </w:pPr>
     <w:r>
       <w:rPr>
-        <w:rFonts w:ascii="Tahoma" w:hAnsi="Tahoma" w:eastAsia="Tahoma"/>
+        <w:rFonts w:ascii="Thonburi" w:hAnsi="Thonburi" w:eastAsia="Thonburi"/>
+        <w:b/>
+        <w:color w:val="596579"/>
+        <w:sz w:val="17"/>
+      </w:rPr>
+      <w:t>คู่มือผู้ใช้งาน  •  Digital Twin CCTV</w:t>
+    </w:r>
+  </w:p>
+</w:hdr>
+</file>
+
+<file path=word/header2.xml><?xml version="1.0" encoding="utf-8"?>
+<w:hdr xmlns:m="http://schemas.openxmlformats.org/officeDocument/2006/math" xmlns:mc="http://schemas.openxmlformats.org/markup-compatibility/2006" xmlns:mo="http://schemas.microsoft.com/office/mac/office/2008/main" xmlns:mv="urn:schemas-microsoft-com:mac:vml" xmlns:o="urn:schemas-microsoft-com:office:office" xmlns:r="http://schemas.openxmlformats.org/officeDocument/2006/relationships" xmlns:v="urn:schemas-microsoft-com:vml" xmlns:w10="urn:schemas-microsoft-com:office:word" xmlns:w14="http://schemas.microsoft.com/office/word/2010/wordml" xmlns:w="http://schemas.openxmlformats.org/wordprocessingml/2006/main" xmlns:wne="http://schemas.microsoft.com/office/word/2006/wordml" xmlns:wp14="http://schemas.microsoft.com/office/word/2010/wordprocessingDrawing" xmlns:wp="http://schemas.openxmlformats.org/drawingml/2006/wordprocessingDrawing" xmlns:wpc="http://schemas.microsoft.com/office/word/2010/wordprocessingCanvas" xmlns:wpg="http://schemas.microsoft.com/office/word/2010/wordprocessingGroup" xmlns:wpi="http://schemas.microsoft.com/office/word/2010/wordprocessingInk" xmlns:wps="http://schemas.microsoft.com/office/word/2010/wordprocessingShape" mc:Ignorable="w14 wp14">
+  <w:p>
+    <w:pPr>
+      <w:pStyle w:val="Header"/>
+      <w:keepNext w:val="0"/>
+      <w:spacing w:before="0" w:after="0" w:line="240" w:lineRule="auto"/>
+      <w:jc w:val="left"/>
+      <w:pBdr>
+        <w:bottom w:val="single" w:sz="4" w:space="4" w:color="CED8E3"/>
+      </w:pBdr>
+    </w:pPr>
+    <w:r>
+      <w:rPr>
+        <w:rFonts w:ascii="Thonburi" w:hAnsi="Thonburi" w:eastAsia="Thonburi"/>
         <w:b/>
         <w:color w:val="596579"/>
         <w:sz w:val="17"/>
@@ -2877,12 +2939,100 @@
         <w:spacing w:after="80" w:line="300" w:lineRule="auto"/>
       </w:pPr>
       <w:rPr>
-        <w:rFonts w:ascii="Tahoma" w:hAnsi="Tahoma" w:eastAsia="Tahoma"/>
+        <w:rFonts w:ascii="Thonburi" w:hAnsi="Thonburi" w:eastAsia="Thonburi"/>
       </w:rPr>
     </w:lvl>
   </w:abstractNum>
   <w:num w:numId="41">
     <w:abstractNumId w:val="41"/>
+  </w:num>
+  <w:abstractNum w:abstractNumId="42">
+    <w:multiLevelType w:val="singleLevel"/>
+    <w:lvl w:ilvl="0">
+      <w:start w:val="1"/>
+      <w:numFmt w:val="decimal"/>
+      <w:lvlText w:val="%1."/>
+      <w:suff w:val="tab"/>
+      <w:pPr>
+        <w:tabs>
+          <w:tab w:val="num" w:pos="540"/>
+        </w:tabs>
+        <w:ind w:left="540" w:hanging="270"/>
+        <w:spacing w:after="80" w:line="300" w:lineRule="auto"/>
+      </w:pPr>
+      <w:rPr>
+        <w:rFonts w:ascii="Thonburi" w:hAnsi="Thonburi" w:eastAsia="Thonburi"/>
+      </w:rPr>
+    </w:lvl>
+  </w:abstractNum>
+  <w:num w:numId="42">
+    <w:abstractNumId w:val="42"/>
+  </w:num>
+  <w:abstractNum w:abstractNumId="43">
+    <w:multiLevelType w:val="singleLevel"/>
+    <w:lvl w:ilvl="0">
+      <w:start w:val="1"/>
+      <w:numFmt w:val="decimal"/>
+      <w:lvlText w:val="%1."/>
+      <w:suff w:val="tab"/>
+      <w:pPr>
+        <w:tabs>
+          <w:tab w:val="num" w:pos="540"/>
+        </w:tabs>
+        <w:ind w:left="540" w:hanging="270"/>
+        <w:spacing w:after="80" w:line="300" w:lineRule="auto"/>
+      </w:pPr>
+      <w:rPr>
+        <w:rFonts w:ascii="Thonburi" w:hAnsi="Thonburi" w:eastAsia="Thonburi"/>
+      </w:rPr>
+    </w:lvl>
+  </w:abstractNum>
+  <w:num w:numId="43">
+    <w:abstractNumId w:val="43"/>
+  </w:num>
+  <w:abstractNum w:abstractNumId="44">
+    <w:multiLevelType w:val="singleLevel"/>
+    <w:lvl w:ilvl="0">
+      <w:start w:val="1"/>
+      <w:numFmt w:val="decimal"/>
+      <w:lvlText w:val="%1."/>
+      <w:suff w:val="tab"/>
+      <w:pPr>
+        <w:tabs>
+          <w:tab w:val="num" w:pos="540"/>
+        </w:tabs>
+        <w:ind w:left="540" w:hanging="270"/>
+        <w:spacing w:after="80" w:line="300" w:lineRule="auto"/>
+      </w:pPr>
+      <w:rPr>
+        <w:rFonts w:ascii="Thonburi" w:hAnsi="Thonburi" w:eastAsia="Thonburi"/>
+      </w:rPr>
+    </w:lvl>
+  </w:abstractNum>
+  <w:num w:numId="44">
+    <w:abstractNumId w:val="44"/>
+  </w:num>
+  <w:abstractNum w:abstractNumId="45">
+    <w:multiLevelType w:val="singleLevel"/>
+    <w:lvl w:ilvl="0">
+      <w:start w:val="1"/>
+      <w:numFmt w:val="decimal"/>
+      <w:lvlText w:val="%1."/>
+      <w:suff w:val="tab"/>
+      <w:pPr>
+        <w:tabs>
+          <w:tab w:val="num" w:pos="540"/>
+        </w:tabs>
+        <w:ind w:left="540" w:hanging="270"/>
+        <w:spacing w:after="80" w:line="300" w:lineRule="auto"/>
+      </w:pPr>
+      <w:rPr>
+        <w:rFonts w:ascii="Thonburi" w:hAnsi="Thonburi" w:eastAsia="Thonburi"/>
+      </w:rPr>
+    </w:lvl>
+  </w:abstractNum>
+  <w:num w:numId="45">
+    <w:abstractNumId w:val="45"/>
   </w:num>
 </w:numbering>
 </file>
@@ -3051,7 +3201,7 @@
       <w:spacing w:before="0" w:after="120" w:line="300" w:lineRule="auto"/>
     </w:pPr>
     <w:rPr>
-      <w:rFonts w:ascii="Tahoma" w:hAnsi="Tahoma" w:eastAsia="Tahoma"/>
+      <w:rFonts w:ascii="Thonburi" w:hAnsi="Thonburi" w:eastAsia="Thonburi"/>
       <w:color w:val="172033"/>
       <w:sz w:val="22"/>
     </w:rPr>
@@ -3115,7 +3265,7 @@
       <w:outlineLvl w:val="0"/>
     </w:pPr>
     <w:rPr>
-      <w:rFonts w:asciiTheme="majorHAnsi" w:eastAsiaTheme="majorEastAsia" w:hAnsiTheme="majorHAnsi" w:cstheme="majorBidi" w:ascii="Tahoma" w:hAnsi="Tahoma" w:eastAsia="Tahoma"/>
+      <w:rFonts w:asciiTheme="majorHAnsi" w:eastAsiaTheme="majorEastAsia" w:hAnsiTheme="majorHAnsi" w:cstheme="majorBidi" w:ascii="Thonburi" w:hAnsi="Thonburi" w:eastAsia="Thonburi"/>
       <w:b/>
       <w:bCs/>
       <w:color w:val="0072CE"/>
@@ -3139,7 +3289,7 @@
       <w:outlineLvl w:val="1"/>
     </w:pPr>
     <w:rPr>
-      <w:rFonts w:asciiTheme="majorHAnsi" w:eastAsiaTheme="majorEastAsia" w:hAnsiTheme="majorHAnsi" w:cstheme="majorBidi" w:ascii="Tahoma" w:hAnsi="Tahoma" w:eastAsia="Tahoma"/>
+      <w:rFonts w:asciiTheme="majorHAnsi" w:eastAsiaTheme="majorEastAsia" w:hAnsiTheme="majorHAnsi" w:cstheme="majorBidi" w:ascii="Thonburi" w:hAnsi="Thonburi" w:eastAsia="Thonburi"/>
       <w:b/>
       <w:bCs/>
       <w:color w:val="0072CE"/>
@@ -3163,7 +3313,7 @@
       <w:outlineLvl w:val="2"/>
     </w:pPr>
     <w:rPr>
-      <w:rFonts w:asciiTheme="majorHAnsi" w:eastAsiaTheme="majorEastAsia" w:hAnsiTheme="majorHAnsi" w:cstheme="majorBidi" w:ascii="Tahoma" w:hAnsi="Tahoma" w:eastAsia="Tahoma"/>
+      <w:rFonts w:asciiTheme="majorHAnsi" w:eastAsiaTheme="majorEastAsia" w:hAnsiTheme="majorHAnsi" w:cstheme="majorBidi" w:ascii="Thonburi" w:hAnsi="Thonburi" w:eastAsia="Thonburi"/>
       <w:b/>
       <w:bCs/>
       <w:color w:val="0B2545"/>

</xml_diff>

<commit_message>
Aug 18, 2026, 7:20 PM
</commit_message>
<xml_diff>
--- a/docs/CCTV-Google-Drive-User-Guide-TH.docx
+++ b/docs/CCTV-Google-Drive-User-Guide-TH.docx
@@ -10,10 +10,12 @@
       </w:pPr>
       <w:r>
         <w:rPr>
-          <w:rFonts w:ascii="Thonburi" w:hAnsi="Thonburi" w:eastAsia="Thonburi"/>
+          <w:rFonts w:ascii="Tahoma" w:hAnsi="Tahoma" w:eastAsia="Tahoma" w:cs="Tahoma"/>
           <w:b/>
           <w:color w:val="0072CE"/>
           <w:sz w:val="20"/>
+          <w:cs/>
+          <w:lang w:val="th-TH" w:bidi="th-TH"/>
         </w:rPr>
         <w:t>คู่มือการใช้งาน</w:t>
       </w:r>
@@ -27,7 +29,7 @@
         <w:drawing>
           <wp:inline xmlns:a="http://schemas.openxmlformats.org/drawingml/2006/main" xmlns:pic="http://schemas.openxmlformats.org/drawingml/2006/picture">
             <wp:extent cx="1417320" cy="596766"/>
-            <wp:docPr id="1" name="Picture 1" descr="National Telecom company logo" title="National Telecom logo"/>
+            <wp:docPr id="1" name="Picture 1" descr="โลโก้ NT National Telecom" title="NT National Telecom"/>
             <wp:cNvGraphicFramePr>
               <a:graphicFrameLocks noChangeAspect="1"/>
             </wp:cNvGraphicFramePr>
@@ -66,10 +68,12 @@
       </w:pPr>
       <w:r>
         <w:rPr>
-          <w:rFonts w:ascii="Thonburi" w:hAnsi="Thonburi" w:eastAsia="Thonburi"/>
+          <w:rFonts w:ascii="Tahoma" w:hAnsi="Tahoma" w:eastAsia="Tahoma" w:cs="Tahoma"/>
           <w:b/>
           <w:color w:val="0B2545"/>
           <w:sz w:val="56"/>
+          <w:cs/>
+          <w:lang w:val="th-TH" w:bidi="th-TH"/>
         </w:rPr>
         <w:t>สร้างกล้อง CCTV</w:t>
       </w:r>
@@ -82,10 +86,12 @@
       </w:pPr>
       <w:r>
         <w:rPr>
-          <w:rFonts w:ascii="Thonburi" w:hAnsi="Thonburi" w:eastAsia="Thonburi"/>
+          <w:rFonts w:ascii="Tahoma" w:hAnsi="Tahoma" w:eastAsia="Tahoma" w:cs="Tahoma"/>
           <w:b/>
           <w:color w:val="0072CE"/>
           <w:sz w:val="40"/>
+          <w:cs/>
+          <w:lang w:val="th-TH" w:bidi="th-TH"/>
         </w:rPr>
         <w:t>และเชื่อมต่อภาพจาก Google Drive</w:t>
       </w:r>
@@ -98,10 +104,12 @@
       </w:pPr>
       <w:r>
         <w:rPr>
-          <w:rFonts w:ascii="Thonburi" w:hAnsi="Thonburi" w:eastAsia="Thonburi"/>
+          <w:rFonts w:ascii="Tahoma" w:hAnsi="Tahoma" w:eastAsia="Tahoma" w:cs="Tahoma"/>
           <w:b w:val="0"/>
           <w:color w:val="596579"/>
           <w:sz w:val="24"/>
+          <w:cs/>
+          <w:lang w:val="th-TH" w:bidi="th-TH"/>
         </w:rPr>
         <w:t>สำหรับผู้ใช้งานระบบ Digital Twin</w:t>
       </w:r>
@@ -118,18 +126,22 @@
       </w:pPr>
       <w:r>
         <w:rPr>
-          <w:rFonts w:ascii="Thonburi" w:hAnsi="Thonburi" w:eastAsia="Thonburi"/>
+          <w:rFonts w:ascii="Tahoma" w:hAnsi="Tahoma" w:eastAsia="Tahoma" w:cs="Tahoma"/>
           <w:b/>
           <w:color w:val="0072CE"/>
           <w:sz w:val="21"/>
+          <w:cs/>
+          <w:lang w:val="th-TH" w:bidi="th-TH"/>
         </w:rPr>
         <w:t xml:space="preserve">สิ่งที่ระบบทำให้  </w:t>
       </w:r>
       <w:r>
         <w:rPr>
-          <w:rFonts w:ascii="Thonburi" w:hAnsi="Thonburi" w:eastAsia="Thonburi"/>
+          <w:rFonts w:ascii="Tahoma" w:hAnsi="Tahoma" w:eastAsia="Tahoma" w:cs="Tahoma"/>
           <w:color w:val="172033"/>
           <w:sz w:val="21"/>
+          <w:cs/>
+          <w:lang w:val="th-TH" w:bidi="th-TH"/>
         </w:rPr>
         <w:t>กล้องที่เชื่อม Google Drive จะดึงภาพล่าสุดจากโฟลเดอร์ ปี/เดือน/วัน และอัปเดตเฉพาะภาพของกล้องทุก 5 วินาที โดยไม่รีเฟรชทั้งหน้า</w:t>
       </w:r>
@@ -142,10 +154,12 @@
       </w:pPr>
       <w:r>
         <w:rPr>
-          <w:rFonts w:ascii="Thonburi" w:hAnsi="Thonburi" w:eastAsia="Thonburi"/>
+          <w:rFonts w:ascii="Tahoma" w:hAnsi="Tahoma" w:eastAsia="Tahoma" w:cs="Tahoma"/>
           <w:b w:val="0"/>
           <w:color w:val="596579"/>
           <w:sz w:val="19"/>
+          <w:cs/>
+          <w:lang w:val="th-TH" w:bidi="th-TH"/>
         </w:rPr>
         <w:t>เวอร์ชัน 1.0  |  18 สิงหาคม 2569</w:t>
       </w:r>
@@ -170,10 +184,12 @@
       </w:pPr>
       <w:r>
         <w:rPr>
-          <w:rFonts w:ascii="Thonburi" w:hAnsi="Thonburi" w:eastAsia="Thonburi"/>
+          <w:rFonts w:ascii="Tahoma" w:hAnsi="Tahoma" w:eastAsia="Tahoma" w:cs="Tahoma"/>
           <w:b w:val="0"/>
           <w:color w:val="172033"/>
           <w:sz w:val="22"/>
+          <w:cs/>
+          <w:lang w:val="th-TH" w:bidi="th-TH"/>
         </w:rPr>
         <w:t>คู่มือนี้ใช้สำหรับผู้ที่มีสิทธิ์จัดการกล้อง CCTV ในระบบ หากไม่พบปุ่ม “เพิ่มกล้อง” ให้ติดต่อผู้ดูแลระบบเพื่อขอสิทธิ์ cctv.manage</w:t>
       </w:r>
@@ -197,18 +213,22 @@
       </w:pPr>
       <w:r>
         <w:rPr>
-          <w:rFonts w:ascii="Thonburi" w:hAnsi="Thonburi" w:eastAsia="Thonburi"/>
+          <w:rFonts w:ascii="Tahoma" w:hAnsi="Tahoma" w:eastAsia="Tahoma" w:cs="Tahoma"/>
           <w:b/>
           <w:color w:val="0B2545"/>
           <w:sz w:val="22"/>
+          <w:cs/>
+          <w:lang w:val="th-TH" w:bidi="th-TH"/>
         </w:rPr>
         <w:t>ข้อมูลกล้อง</w:t>
       </w:r>
       <w:r>
         <w:rPr>
-          <w:rFonts w:ascii="Thonburi" w:hAnsi="Thonburi" w:eastAsia="Thonburi"/>
+          <w:rFonts w:ascii="Tahoma" w:hAnsi="Tahoma" w:eastAsia="Tahoma" w:cs="Tahoma"/>
           <w:color w:val="172033"/>
           <w:sz w:val="22"/>
+          <w:cs/>
+          <w:lang w:val="th-TH" w:bidi="th-TH"/>
         </w:rPr>
         <w:t xml:space="preserve"> — รหัสกล้อง ชื่อ สถานะ อำเภอ และพิกัด (ถ้ามี)</w:t>
       </w:r>
@@ -224,7 +244,7 @@
       </w:pPr>
       <w:r>
         <w:rPr>
-          <w:rFonts w:ascii="Thonburi" w:hAnsi="Thonburi" w:eastAsia="Thonburi"/>
+          <w:rFonts w:ascii="Tahoma" w:hAnsi="Tahoma" w:eastAsia="Tahoma" w:cs="Tahoma"/>
           <w:b/>
           <w:color w:val="0B2545"/>
           <w:sz w:val="22"/>
@@ -233,9 +253,11 @@
       </w:r>
       <w:r>
         <w:rPr>
-          <w:rFonts w:ascii="Thonburi" w:hAnsi="Thonburi" w:eastAsia="Thonburi"/>
+          <w:rFonts w:ascii="Tahoma" w:hAnsi="Tahoma" w:eastAsia="Tahoma" w:cs="Tahoma"/>
           <w:color w:val="172033"/>
           <w:sz w:val="22"/>
+          <w:cs/>
+          <w:lang w:val="th-TH" w:bidi="th-TH"/>
         </w:rPr>
         <w:t xml:space="preserve"> — หนึ่งโฟลเดอร์หลักต่อกล้อง พร้อมโครงสร้าง ปี/เดือน/วัน</w:t>
       </w:r>
@@ -251,18 +273,22 @@
       </w:pPr>
       <w:r>
         <w:rPr>
-          <w:rFonts w:ascii="Thonburi" w:hAnsi="Thonburi" w:eastAsia="Thonburi"/>
+          <w:rFonts w:ascii="Tahoma" w:hAnsi="Tahoma" w:eastAsia="Tahoma" w:cs="Tahoma"/>
           <w:b/>
           <w:color w:val="0B2545"/>
           <w:sz w:val="22"/>
+          <w:cs/>
+          <w:lang w:val="th-TH" w:bidi="th-TH"/>
         </w:rPr>
         <w:t>สิทธิ์ดูผ่านลิงก์</w:t>
       </w:r>
       <w:r>
         <w:rPr>
-          <w:rFonts w:ascii="Thonburi" w:hAnsi="Thonburi" w:eastAsia="Thonburi"/>
+          <w:rFonts w:ascii="Tahoma" w:hAnsi="Tahoma" w:eastAsia="Tahoma" w:cs="Tahoma"/>
           <w:color w:val="172033"/>
           <w:sz w:val="22"/>
+          <w:cs/>
+          <w:lang w:val="th-TH" w:bidi="th-TH"/>
         </w:rPr>
         <w:t xml:space="preserve"> — ตั้งค่า root folder เป็น Anyone with the link และบทบาท Viewer</w:t>
       </w:r>
@@ -279,18 +305,22 @@
       </w:pPr>
       <w:r>
         <w:rPr>
-          <w:rFonts w:ascii="Thonburi" w:hAnsi="Thonburi" w:eastAsia="Thonburi"/>
+          <w:rFonts w:ascii="Tahoma" w:hAnsi="Tahoma" w:eastAsia="Tahoma" w:cs="Tahoma"/>
           <w:b/>
           <w:color w:val="9A7500"/>
           <w:sz w:val="21"/>
+          <w:cs/>
+          <w:lang w:val="th-TH" w:bidi="th-TH"/>
         </w:rPr>
         <w:t xml:space="preserve">ผู้ใช้ไม่ต้องมี API Key  </w:t>
       </w:r>
       <w:r>
         <w:rPr>
-          <w:rFonts w:ascii="Thonburi" w:hAnsi="Thonburi" w:eastAsia="Thonburi"/>
+          <w:rFonts w:ascii="Tahoma" w:hAnsi="Tahoma" w:eastAsia="Tahoma" w:cs="Tahoma"/>
           <w:color w:val="172033"/>
           <w:sz w:val="21"/>
+          <w:cs/>
+          <w:lang w:val="th-TH" w:bidi="th-TH"/>
         </w:rPr>
         <w:t>Google Drive API Key เป็นค่าที่ผู้ดูแลระบบตั้งไว้บนเซิร์ฟเวอร์ ผู้ใช้เพียงเตรียมโฟลเดอร์และวาง URL ในฟอร์มกล้อง</w:t>
       </w:r>
@@ -318,10 +348,12 @@
       </w:pPr>
       <w:r>
         <w:rPr>
-          <w:rFonts w:ascii="Thonburi" w:hAnsi="Thonburi" w:eastAsia="Thonburi"/>
+          <w:rFonts w:ascii="Tahoma" w:hAnsi="Tahoma" w:eastAsia="Tahoma" w:cs="Tahoma"/>
           <w:b w:val="0"/>
           <w:color w:val="172033"/>
           <w:sz w:val="22"/>
+          <w:cs/>
+          <w:lang w:val="th-TH" w:bidi="th-TH"/>
         </w:rPr>
         <w:t>สร้างโฟลเดอร์หลักสำหรับกล้อง แล้วสร้างโฟลเดอร์ย่อยด้วยตัวเลขตามลำดับ ตัวอย่างสำหรับกล้อง CCTV-SB-021:</w:t>
       </w:r>
@@ -335,7 +367,7 @@
       </w:pPr>
       <w:r>
         <w:rPr>
-          <w:rFonts w:ascii="Arial Unicode MS" w:hAnsi="Arial Unicode MS" w:eastAsia="Arial Unicode MS"/>
+          <w:rFonts w:ascii="Arial Unicode MS" w:hAnsi="Arial Unicode MS" w:eastAsia="Arial Unicode MS" w:cs="Arial Unicode MS"/>
           <w:color w:val="0B2545"/>
           <w:sz w:val="19"/>
         </w:rPr>
@@ -351,7 +383,7 @@
       </w:pPr>
       <w:r>
         <w:rPr>
-          <w:rFonts w:ascii="Arial Unicode MS" w:hAnsi="Arial Unicode MS" w:eastAsia="Arial Unicode MS"/>
+          <w:rFonts w:ascii="Arial Unicode MS" w:hAnsi="Arial Unicode MS" w:eastAsia="Arial Unicode MS" w:cs="Arial Unicode MS"/>
           <w:color w:val="0B2545"/>
           <w:sz w:val="19"/>
         </w:rPr>
@@ -367,7 +399,7 @@
       </w:pPr>
       <w:r>
         <w:rPr>
-          <w:rFonts w:ascii="Arial Unicode MS" w:hAnsi="Arial Unicode MS" w:eastAsia="Arial Unicode MS"/>
+          <w:rFonts w:ascii="Arial Unicode MS" w:hAnsi="Arial Unicode MS" w:eastAsia="Arial Unicode MS" w:cs="Arial Unicode MS"/>
           <w:color w:val="0B2545"/>
           <w:sz w:val="19"/>
         </w:rPr>
@@ -383,7 +415,7 @@
       </w:pPr>
       <w:r>
         <w:rPr>
-          <w:rFonts w:ascii="Arial Unicode MS" w:hAnsi="Arial Unicode MS" w:eastAsia="Arial Unicode MS"/>
+          <w:rFonts w:ascii="Arial Unicode MS" w:hAnsi="Arial Unicode MS" w:eastAsia="Arial Unicode MS" w:cs="Arial Unicode MS"/>
           <w:color w:val="0B2545"/>
           <w:sz w:val="19"/>
         </w:rPr>
@@ -399,7 +431,7 @@
       </w:pPr>
       <w:r>
         <w:rPr>
-          <w:rFonts w:ascii="Arial Unicode MS" w:hAnsi="Arial Unicode MS" w:eastAsia="Arial Unicode MS"/>
+          <w:rFonts w:ascii="Arial Unicode MS" w:hAnsi="Arial Unicode MS" w:eastAsia="Arial Unicode MS" w:cs="Arial Unicode MS"/>
           <w:color w:val="0B2545"/>
           <w:sz w:val="19"/>
         </w:rPr>
@@ -415,9 +447,11 @@
       </w:pPr>
       <w:r>
         <w:rPr>
-          <w:rFonts w:ascii="Arial Unicode MS" w:hAnsi="Arial Unicode MS" w:eastAsia="Arial Unicode MS"/>
+          <w:rFonts w:ascii="Arial Unicode MS" w:hAnsi="Arial Unicode MS" w:eastAsia="Arial Unicode MS" w:cs="Arial Unicode MS"/>
           <w:color w:val="0B2545"/>
           <w:sz w:val="19"/>
+          <w:cs/>
+          <w:lang w:val="th-TH" w:bidi="th-TH"/>
         </w:rPr>
         <w:t xml:space="preserve">            └── camera_20260818_090005.jpg   ← ภาพล่าสุด</w:t>
       </w:r>
@@ -434,18 +468,22 @@
       </w:pPr>
       <w:r>
         <w:rPr>
-          <w:rFonts w:ascii="Thonburi" w:hAnsi="Thonburi" w:eastAsia="Thonburi"/>
+          <w:rFonts w:ascii="Tahoma" w:hAnsi="Tahoma" w:eastAsia="Tahoma" w:cs="Tahoma"/>
           <w:b/>
           <w:color w:val="596579"/>
           <w:sz w:val="21"/>
+          <w:cs/>
+          <w:lang w:val="th-TH" w:bidi="th-TH"/>
         </w:rPr>
         <w:t xml:space="preserve">รูปแบบชื่อโฟลเดอร์  </w:t>
       </w:r>
       <w:r>
         <w:rPr>
-          <w:rFonts w:ascii="Thonburi" w:hAnsi="Thonburi" w:eastAsia="Thonburi"/>
+          <w:rFonts w:ascii="Tahoma" w:hAnsi="Tahoma" w:eastAsia="Tahoma" w:cs="Tahoma"/>
           <w:color w:val="172033"/>
           <w:sz w:val="21"/>
+          <w:cs/>
+          <w:lang w:val="th-TH" w:bidi="th-TH"/>
         </w:rPr>
         <w:t>ปีต้องเป็นตัวเลข 4 หลัก เช่น 2026 หรือ 2569 ส่วนเดือนและวันใช้ 8 หรือ 08 ได้ ระบบจะเรียงวันที่ล่าสุดและเลือกไฟล์ชนิดภาพที่แก้ไขล่าสุด</w:t>
       </w:r>
@@ -469,18 +507,22 @@
       </w:pPr>
       <w:r>
         <w:rPr>
-          <w:rFonts w:ascii="Thonburi" w:hAnsi="Thonburi" w:eastAsia="Thonburi"/>
+          <w:rFonts w:ascii="Tahoma" w:hAnsi="Tahoma" w:eastAsia="Tahoma" w:cs="Tahoma"/>
           <w:b/>
           <w:color w:val="0B2545"/>
           <w:sz w:val="22"/>
+          <w:cs/>
+          <w:lang w:val="th-TH" w:bidi="th-TH"/>
         </w:rPr>
         <w:t>คลิกขวาที่ root folder</w:t>
       </w:r>
       <w:r>
         <w:rPr>
-          <w:rFonts w:ascii="Thonburi" w:hAnsi="Thonburi" w:eastAsia="Thonburi"/>
+          <w:rFonts w:ascii="Tahoma" w:hAnsi="Tahoma" w:eastAsia="Tahoma" w:cs="Tahoma"/>
           <w:color w:val="172033"/>
           <w:sz w:val="22"/>
+          <w:cs/>
+          <w:lang w:val="th-TH" w:bidi="th-TH"/>
         </w:rPr>
         <w:t xml:space="preserve"> — เลือก Share หรือแชร์</w:t>
       </w:r>
@@ -496,18 +538,22 @@
       </w:pPr>
       <w:r>
         <w:rPr>
-          <w:rFonts w:ascii="Thonburi" w:hAnsi="Thonburi" w:eastAsia="Thonburi"/>
+          <w:rFonts w:ascii="Tahoma" w:hAnsi="Tahoma" w:eastAsia="Tahoma" w:cs="Tahoma"/>
           <w:b/>
           <w:color w:val="0B2545"/>
           <w:sz w:val="22"/>
+          <w:cs/>
+          <w:lang w:val="th-TH" w:bidi="th-TH"/>
         </w:rPr>
         <w:t>เปลี่ยน General access</w:t>
       </w:r>
       <w:r>
         <w:rPr>
-          <w:rFonts w:ascii="Thonburi" w:hAnsi="Thonburi" w:eastAsia="Thonburi"/>
+          <w:rFonts w:ascii="Tahoma" w:hAnsi="Tahoma" w:eastAsia="Tahoma" w:cs="Tahoma"/>
           <w:color w:val="172033"/>
           <w:sz w:val="22"/>
+          <w:cs/>
+          <w:lang w:val="th-TH" w:bidi="th-TH"/>
         </w:rPr>
         <w:t xml:space="preserve"> — เลือก Anyone with the link และกำหนดบทบาท Viewer</w:t>
       </w:r>
@@ -523,18 +569,22 @@
       </w:pPr>
       <w:r>
         <w:rPr>
-          <w:rFonts w:ascii="Thonburi" w:hAnsi="Thonburi" w:eastAsia="Thonburi"/>
+          <w:rFonts w:ascii="Tahoma" w:hAnsi="Tahoma" w:eastAsia="Tahoma" w:cs="Tahoma"/>
           <w:b/>
           <w:color w:val="0B2545"/>
           <w:sz w:val="22"/>
+          <w:cs/>
+          <w:lang w:val="th-TH" w:bidi="th-TH"/>
         </w:rPr>
         <w:t>กด Copy link</w:t>
       </w:r>
       <w:r>
         <w:rPr>
-          <w:rFonts w:ascii="Thonburi" w:hAnsi="Thonburi" w:eastAsia="Thonburi"/>
+          <w:rFonts w:ascii="Tahoma" w:hAnsi="Tahoma" w:eastAsia="Tahoma" w:cs="Tahoma"/>
           <w:color w:val="172033"/>
           <w:sz w:val="22"/>
+          <w:cs/>
+          <w:lang w:val="th-TH" w:bidi="th-TH"/>
         </w:rPr>
         <w:t xml:space="preserve"> — URL ที่ได้ควรมีรูปแบบ https://drive.google.com/drive/folders/…</w:t>
       </w:r>
@@ -551,18 +601,22 @@
       </w:pPr>
       <w:r>
         <w:rPr>
-          <w:rFonts w:ascii="Thonburi" w:hAnsi="Thonburi" w:eastAsia="Thonburi"/>
+          <w:rFonts w:ascii="Tahoma" w:hAnsi="Tahoma" w:eastAsia="Tahoma" w:cs="Tahoma"/>
           <w:b/>
           <w:color w:val="9A7500"/>
           <w:sz w:val="21"/>
+          <w:cs/>
+          <w:lang w:val="th-TH" w:bidi="th-TH"/>
         </w:rPr>
         <w:t xml:space="preserve">สำคัญ  </w:t>
       </w:r>
       <w:r>
         <w:rPr>
-          <w:rFonts w:ascii="Thonburi" w:hAnsi="Thonburi" w:eastAsia="Thonburi"/>
+          <w:rFonts w:ascii="Tahoma" w:hAnsi="Tahoma" w:eastAsia="Tahoma" w:cs="Tahoma"/>
           <w:color w:val="172033"/>
           <w:sz w:val="21"/>
+          <w:cs/>
+          <w:lang w:val="th-TH" w:bidi="th-TH"/>
         </w:rPr>
         <w:t>ใส่ URL ของ root folder ประจำกล้องเท่านั้น ไม่ใช้ URL ของไฟล์ภาพ โฟลเดอร์ปี โฟลเดอร์เดือน หรือโฟลเดอร์วัน</w:t>
       </w:r>
@@ -591,18 +645,22 @@
       </w:pPr>
       <w:r>
         <w:rPr>
-          <w:rFonts w:ascii="Thonburi" w:hAnsi="Thonburi" w:eastAsia="Thonburi"/>
+          <w:rFonts w:ascii="Tahoma" w:hAnsi="Tahoma" w:eastAsia="Tahoma" w:cs="Tahoma"/>
           <w:b/>
           <w:color w:val="0B2545"/>
           <w:sz w:val="22"/>
+          <w:cs/>
+          <w:lang w:val="th-TH" w:bidi="th-TH"/>
         </w:rPr>
         <w:t>เข้าสู่ระบบ Digital Twin</w:t>
       </w:r>
       <w:r>
         <w:rPr>
-          <w:rFonts w:ascii="Thonburi" w:hAnsi="Thonburi" w:eastAsia="Thonburi"/>
+          <w:rFonts w:ascii="Tahoma" w:hAnsi="Tahoma" w:eastAsia="Tahoma" w:cs="Tahoma"/>
           <w:color w:val="172033"/>
           <w:sz w:val="22"/>
+          <w:cs/>
+          <w:lang w:val="th-TH" w:bidi="th-TH"/>
         </w:rPr>
         <w:t xml:space="preserve"> — ใช้บัญชีที่มีสิทธิ์จัดการกล้อง</w:t>
       </w:r>
@@ -618,18 +676,22 @@
       </w:pPr>
       <w:r>
         <w:rPr>
-          <w:rFonts w:ascii="Thonburi" w:hAnsi="Thonburi" w:eastAsia="Thonburi"/>
+          <w:rFonts w:ascii="Tahoma" w:hAnsi="Tahoma" w:eastAsia="Tahoma" w:cs="Tahoma"/>
           <w:b/>
           <w:color w:val="0B2545"/>
           <w:sz w:val="22"/>
+          <w:cs/>
+          <w:lang w:val="th-TH" w:bidi="th-TH"/>
         </w:rPr>
         <w:t>เปิดเมนู CCTV</w:t>
       </w:r>
       <w:r>
         <w:rPr>
-          <w:rFonts w:ascii="Thonburi" w:hAnsi="Thonburi" w:eastAsia="Thonburi"/>
+          <w:rFonts w:ascii="Tahoma" w:hAnsi="Tahoma" w:eastAsia="Tahoma" w:cs="Tahoma"/>
           <w:color w:val="172033"/>
           <w:sz w:val="22"/>
+          <w:cs/>
+          <w:lang w:val="th-TH" w:bidi="th-TH"/>
         </w:rPr>
         <w:t xml:space="preserve"> — เข้าสู่หน้าศูนย์ควบคุม CCTV</w:t>
       </w:r>
@@ -645,18 +707,22 @@
       </w:pPr>
       <w:r>
         <w:rPr>
-          <w:rFonts w:ascii="Thonburi" w:hAnsi="Thonburi" w:eastAsia="Thonburi"/>
+          <w:rFonts w:ascii="Tahoma" w:hAnsi="Tahoma" w:eastAsia="Tahoma" w:cs="Tahoma"/>
           <w:b/>
           <w:color w:val="0B2545"/>
           <w:sz w:val="22"/>
+          <w:cs/>
+          <w:lang w:val="th-TH" w:bidi="th-TH"/>
         </w:rPr>
         <w:t>กดปุ่ม “เพิ่มกล้อง”</w:t>
       </w:r>
       <w:r>
         <w:rPr>
-          <w:rFonts w:ascii="Thonburi" w:hAnsi="Thonburi" w:eastAsia="Thonburi"/>
+          <w:rFonts w:ascii="Tahoma" w:hAnsi="Tahoma" w:eastAsia="Tahoma" w:cs="Tahoma"/>
           <w:color w:val="172033"/>
           <w:sz w:val="22"/>
+          <w:cs/>
+          <w:lang w:val="th-TH" w:bidi="th-TH"/>
         </w:rPr>
         <w:t xml:space="preserve"> — ฟอร์มเพิ่มกล้องจะแสดงในแผงรายละเอียด</w:t>
       </w:r>
@@ -672,18 +738,22 @@
       </w:pPr>
       <w:r>
         <w:rPr>
-          <w:rFonts w:ascii="Thonburi" w:hAnsi="Thonburi" w:eastAsia="Thonburi"/>
+          <w:rFonts w:ascii="Tahoma" w:hAnsi="Tahoma" w:eastAsia="Tahoma" w:cs="Tahoma"/>
           <w:b/>
           <w:color w:val="0B2545"/>
           <w:sz w:val="22"/>
+          <w:cs/>
+          <w:lang w:val="th-TH" w:bidi="th-TH"/>
         </w:rPr>
         <w:t>กรอกข้อมูลกล้อง</w:t>
       </w:r>
       <w:r>
         <w:rPr>
-          <w:rFonts w:ascii="Thonburi" w:hAnsi="Thonburi" w:eastAsia="Thonburi"/>
+          <w:rFonts w:ascii="Tahoma" w:hAnsi="Tahoma" w:eastAsia="Tahoma" w:cs="Tahoma"/>
           <w:color w:val="172033"/>
           <w:sz w:val="22"/>
+          <w:cs/>
+          <w:lang w:val="th-TH" w:bidi="th-TH"/>
         </w:rPr>
         <w:t xml:space="preserve"> — ตรวจสอบรหัสกล้องและชื่อให้ตรงกับหน้างาน</w:t>
       </w:r>
@@ -699,18 +769,22 @@
       </w:pPr>
       <w:r>
         <w:rPr>
-          <w:rFonts w:ascii="Thonburi" w:hAnsi="Thonburi" w:eastAsia="Thonburi"/>
+          <w:rFonts w:ascii="Tahoma" w:hAnsi="Tahoma" w:eastAsia="Tahoma" w:cs="Tahoma"/>
           <w:b/>
           <w:color w:val="0B2545"/>
           <w:sz w:val="22"/>
+          <w:cs/>
+          <w:lang w:val="th-TH" w:bidi="th-TH"/>
         </w:rPr>
         <w:t>วาง Google Drive folder URL</w:t>
       </w:r>
       <w:r>
         <w:rPr>
-          <w:rFonts w:ascii="Thonburi" w:hAnsi="Thonburi" w:eastAsia="Thonburi"/>
+          <w:rFonts w:ascii="Tahoma" w:hAnsi="Tahoma" w:eastAsia="Tahoma" w:cs="Tahoma"/>
           <w:color w:val="172033"/>
           <w:sz w:val="22"/>
+          <w:cs/>
+          <w:lang w:val="th-TH" w:bidi="th-TH"/>
         </w:rPr>
         <w:t xml:space="preserve"> — ใช้ URL ของ root folder ที่คัดลอกไว้</w:t>
       </w:r>
@@ -726,18 +800,22 @@
       </w:pPr>
       <w:r>
         <w:rPr>
-          <w:rFonts w:ascii="Thonburi" w:hAnsi="Thonburi" w:eastAsia="Thonburi"/>
+          <w:rFonts w:ascii="Tahoma" w:hAnsi="Tahoma" w:eastAsia="Tahoma" w:cs="Tahoma"/>
           <w:b/>
           <w:color w:val="0B2545"/>
           <w:sz w:val="22"/>
+          <w:cs/>
+          <w:lang w:val="th-TH" w:bidi="th-TH"/>
         </w:rPr>
         <w:t>กด “บันทึก”</w:t>
       </w:r>
       <w:r>
         <w:rPr>
-          <w:rFonts w:ascii="Thonburi" w:hAnsi="Thonburi" w:eastAsia="Thonburi"/>
+          <w:rFonts w:ascii="Tahoma" w:hAnsi="Tahoma" w:eastAsia="Tahoma" w:cs="Tahoma"/>
           <w:color w:val="172033"/>
           <w:sz w:val="22"/>
+          <w:cs/>
+          <w:lang w:val="th-TH" w:bidi="th-TH"/>
         </w:rPr>
         <w:t xml:space="preserve"> — ระบบตรวจสอบรูปแบบ URL และสร้างกล้อง</w:t>
       </w:r>
@@ -787,10 +865,12 @@
             </w:pPr>
             <w:r>
               <w:rPr>
-                <w:rFonts w:ascii="Thonburi" w:hAnsi="Thonburi" w:eastAsia="Thonburi"/>
+                <w:rFonts w:ascii="Tahoma" w:hAnsi="Tahoma" w:eastAsia="Tahoma" w:cs="Tahoma"/>
                 <w:b/>
                 <w:color w:val="FFFFFF"/>
                 <w:sz w:val="19"/>
+                <w:cs/>
+                <w:lang w:val="th-TH" w:bidi="th-TH"/>
               </w:rPr>
               <w:t>ช่องข้อมูล</w:t>
             </w:r>
@@ -815,10 +895,12 @@
             </w:pPr>
             <w:r>
               <w:rPr>
-                <w:rFonts w:ascii="Thonburi" w:hAnsi="Thonburi" w:eastAsia="Thonburi"/>
+                <w:rFonts w:ascii="Tahoma" w:hAnsi="Tahoma" w:eastAsia="Tahoma" w:cs="Tahoma"/>
                 <w:b/>
                 <w:color w:val="FFFFFF"/>
                 <w:sz w:val="19"/>
+                <w:cs/>
+                <w:lang w:val="th-TH" w:bidi="th-TH"/>
               </w:rPr>
               <w:t>จำเป็น</w:t>
             </w:r>
@@ -843,10 +925,12 @@
             </w:pPr>
             <w:r>
               <w:rPr>
-                <w:rFonts w:ascii="Thonburi" w:hAnsi="Thonburi" w:eastAsia="Thonburi"/>
+                <w:rFonts w:ascii="Tahoma" w:hAnsi="Tahoma" w:eastAsia="Tahoma" w:cs="Tahoma"/>
                 <w:b/>
                 <w:color w:val="FFFFFF"/>
                 <w:sz w:val="19"/>
+                <w:cs/>
+                <w:lang w:val="th-TH" w:bidi="th-TH"/>
               </w:rPr>
               <w:t>ตัวอย่าง</w:t>
             </w:r>
@@ -871,10 +955,12 @@
             </w:pPr>
             <w:r>
               <w:rPr>
-                <w:rFonts w:ascii="Thonburi" w:hAnsi="Thonburi" w:eastAsia="Thonburi"/>
+                <w:rFonts w:ascii="Tahoma" w:hAnsi="Tahoma" w:eastAsia="Tahoma" w:cs="Tahoma"/>
                 <w:b/>
                 <w:color w:val="FFFFFF"/>
                 <w:sz w:val="19"/>
+                <w:cs/>
+                <w:lang w:val="th-TH" w:bidi="th-TH"/>
               </w:rPr>
               <w:t>คำอธิบาย</w:t>
             </w:r>
@@ -900,9 +986,11 @@
             </w:pPr>
             <w:r>
               <w:rPr>
-                <w:rFonts w:ascii="Thonburi" w:hAnsi="Thonburi" w:eastAsia="Thonburi"/>
+                <w:rFonts w:ascii="Tahoma" w:hAnsi="Tahoma" w:eastAsia="Tahoma" w:cs="Tahoma"/>
                 <w:color w:val="172033"/>
                 <w:sz w:val="18"/>
+                <w:cs/>
+                <w:lang w:val="th-TH" w:bidi="th-TH"/>
               </w:rPr>
               <w:t>รหัสกล้อง</w:t>
             </w:r>
@@ -926,9 +1014,11 @@
             </w:pPr>
             <w:r>
               <w:rPr>
-                <w:rFonts w:ascii="Thonburi" w:hAnsi="Thonburi" w:eastAsia="Thonburi"/>
+                <w:rFonts w:ascii="Tahoma" w:hAnsi="Tahoma" w:eastAsia="Tahoma" w:cs="Tahoma"/>
                 <w:color w:val="172033"/>
                 <w:sz w:val="18"/>
+                <w:cs/>
+                <w:lang w:val="th-TH" w:bidi="th-TH"/>
               </w:rPr>
               <w:t>ใช่</w:t>
             </w:r>
@@ -952,7 +1042,7 @@
             </w:pPr>
             <w:r>
               <w:rPr>
-                <w:rFonts w:ascii="Thonburi" w:hAnsi="Thonburi" w:eastAsia="Thonburi"/>
+                <w:rFonts w:ascii="Tahoma" w:hAnsi="Tahoma" w:eastAsia="Tahoma" w:cs="Tahoma"/>
                 <w:color w:val="172033"/>
                 <w:sz w:val="18"/>
               </w:rPr>
@@ -978,9 +1068,11 @@
             </w:pPr>
             <w:r>
               <w:rPr>
-                <w:rFonts w:ascii="Thonburi" w:hAnsi="Thonburi" w:eastAsia="Thonburi"/>
+                <w:rFonts w:ascii="Tahoma" w:hAnsi="Tahoma" w:eastAsia="Tahoma" w:cs="Tahoma"/>
                 <w:color w:val="172033"/>
                 <w:sz w:val="18"/>
+                <w:cs/>
+                <w:lang w:val="th-TH" w:bidi="th-TH"/>
               </w:rPr>
               <w:t>ใช้ตัวอักษร ตัวเลข จุด ขีดกลาง หรือขีดล่าง และห้ามซ้ำ</w:t>
             </w:r>
@@ -1007,9 +1099,11 @@
             </w:pPr>
             <w:r>
               <w:rPr>
-                <w:rFonts w:ascii="Thonburi" w:hAnsi="Thonburi" w:eastAsia="Thonburi"/>
+                <w:rFonts w:ascii="Tahoma" w:hAnsi="Tahoma" w:eastAsia="Tahoma" w:cs="Tahoma"/>
                 <w:color w:val="172033"/>
                 <w:sz w:val="18"/>
+                <w:cs/>
+                <w:lang w:val="th-TH" w:bidi="th-TH"/>
               </w:rPr>
               <w:t>ชื่อภาษาไทย</w:t>
             </w:r>
@@ -1034,9 +1128,11 @@
             </w:pPr>
             <w:r>
               <w:rPr>
-                <w:rFonts w:ascii="Thonburi" w:hAnsi="Thonburi" w:eastAsia="Thonburi"/>
+                <w:rFonts w:ascii="Tahoma" w:hAnsi="Tahoma" w:eastAsia="Tahoma" w:cs="Tahoma"/>
                 <w:color w:val="172033"/>
                 <w:sz w:val="18"/>
+                <w:cs/>
+                <w:lang w:val="th-TH" w:bidi="th-TH"/>
               </w:rPr>
               <w:t>ใช่</w:t>
             </w:r>
@@ -1061,9 +1157,11 @@
             </w:pPr>
             <w:r>
               <w:rPr>
-                <w:rFonts w:ascii="Thonburi" w:hAnsi="Thonburi" w:eastAsia="Thonburi"/>
+                <w:rFonts w:ascii="Tahoma" w:hAnsi="Tahoma" w:eastAsia="Tahoma" w:cs="Tahoma"/>
                 <w:color w:val="172033"/>
                 <w:sz w:val="18"/>
+                <w:cs/>
+                <w:lang w:val="th-TH" w:bidi="th-TH"/>
               </w:rPr>
               <w:t>กล้องหน้าศาลากลาง</w:t>
             </w:r>
@@ -1088,9 +1186,11 @@
             </w:pPr>
             <w:r>
               <w:rPr>
-                <w:rFonts w:ascii="Thonburi" w:hAnsi="Thonburi" w:eastAsia="Thonburi"/>
+                <w:rFonts w:ascii="Tahoma" w:hAnsi="Tahoma" w:eastAsia="Tahoma" w:cs="Tahoma"/>
                 <w:color w:val="172033"/>
                 <w:sz w:val="18"/>
+                <w:cs/>
+                <w:lang w:val="th-TH" w:bidi="th-TH"/>
               </w:rPr>
               <w:t>ชื่อที่ผู้ใช้เห็นในรายการกล้อง</w:t>
             </w:r>
@@ -1116,9 +1216,11 @@
             </w:pPr>
             <w:r>
               <w:rPr>
-                <w:rFonts w:ascii="Thonburi" w:hAnsi="Thonburi" w:eastAsia="Thonburi"/>
+                <w:rFonts w:ascii="Tahoma" w:hAnsi="Tahoma" w:eastAsia="Tahoma" w:cs="Tahoma"/>
                 <w:color w:val="172033"/>
                 <w:sz w:val="18"/>
+                <w:cs/>
+                <w:lang w:val="th-TH" w:bidi="th-TH"/>
               </w:rPr>
               <w:t>ชื่อภาษาอังกฤษ</w:t>
             </w:r>
@@ -1142,9 +1244,11 @@
             </w:pPr>
             <w:r>
               <w:rPr>
-                <w:rFonts w:ascii="Thonburi" w:hAnsi="Thonburi" w:eastAsia="Thonburi"/>
+                <w:rFonts w:ascii="Tahoma" w:hAnsi="Tahoma" w:eastAsia="Tahoma" w:cs="Tahoma"/>
                 <w:color w:val="172033"/>
                 <w:sz w:val="18"/>
+                <w:cs/>
+                <w:lang w:val="th-TH" w:bidi="th-TH"/>
               </w:rPr>
               <w:t>ไม่</w:t>
             </w:r>
@@ -1168,7 +1272,7 @@
             </w:pPr>
             <w:r>
               <w:rPr>
-                <w:rFonts w:ascii="Thonburi" w:hAnsi="Thonburi" w:eastAsia="Thonburi"/>
+                <w:rFonts w:ascii="Tahoma" w:hAnsi="Tahoma" w:eastAsia="Tahoma" w:cs="Tahoma"/>
                 <w:color w:val="172033"/>
                 <w:sz w:val="18"/>
               </w:rPr>
@@ -1194,9 +1298,11 @@
             </w:pPr>
             <w:r>
               <w:rPr>
-                <w:rFonts w:ascii="Thonburi" w:hAnsi="Thonburi" w:eastAsia="Thonburi"/>
+                <w:rFonts w:ascii="Tahoma" w:hAnsi="Tahoma" w:eastAsia="Tahoma" w:cs="Tahoma"/>
                 <w:color w:val="172033"/>
                 <w:sz w:val="18"/>
+                <w:cs/>
+                <w:lang w:val="th-TH" w:bidi="th-TH"/>
               </w:rPr>
               <w:t>เว้นว่างได้</w:t>
             </w:r>
@@ -1223,7 +1329,7 @@
             </w:pPr>
             <w:r>
               <w:rPr>
-                <w:rFonts w:ascii="Thonburi" w:hAnsi="Thonburi" w:eastAsia="Thonburi"/>
+                <w:rFonts w:ascii="Tahoma" w:hAnsi="Tahoma" w:eastAsia="Tahoma" w:cs="Tahoma"/>
                 <w:color w:val="172033"/>
                 <w:sz w:val="18"/>
               </w:rPr>
@@ -1250,9 +1356,11 @@
             </w:pPr>
             <w:r>
               <w:rPr>
-                <w:rFonts w:ascii="Thonburi" w:hAnsi="Thonburi" w:eastAsia="Thonburi"/>
+                <w:rFonts w:ascii="Tahoma" w:hAnsi="Tahoma" w:eastAsia="Tahoma" w:cs="Tahoma"/>
                 <w:color w:val="172033"/>
                 <w:sz w:val="18"/>
+                <w:cs/>
+                <w:lang w:val="th-TH" w:bidi="th-TH"/>
               </w:rPr>
               <w:t>แนะนำ</w:t>
             </w:r>
@@ -1277,7 +1385,7 @@
             </w:pPr>
             <w:r>
               <w:rPr>
-                <w:rFonts w:ascii="Thonburi" w:hAnsi="Thonburi" w:eastAsia="Thonburi"/>
+                <w:rFonts w:ascii="Tahoma" w:hAnsi="Tahoma" w:eastAsia="Tahoma" w:cs="Tahoma"/>
                 <w:color w:val="172033"/>
                 <w:sz w:val="18"/>
               </w:rPr>
@@ -1304,9 +1412,11 @@
             </w:pPr>
             <w:r>
               <w:rPr>
-                <w:rFonts w:ascii="Thonburi" w:hAnsi="Thonburi" w:eastAsia="Thonburi"/>
+                <w:rFonts w:ascii="Tahoma" w:hAnsi="Tahoma" w:eastAsia="Tahoma" w:cs="Tahoma"/>
                 <w:color w:val="172033"/>
                 <w:sz w:val="18"/>
+                <w:cs/>
+                <w:lang w:val="th-TH" w:bidi="th-TH"/>
               </w:rPr>
               <w:t>root folder ที่มีโครงสร้าง ปี/เดือน/วัน</w:t>
             </w:r>
@@ -1332,9 +1442,11 @@
             </w:pPr>
             <w:r>
               <w:rPr>
-                <w:rFonts w:ascii="Thonburi" w:hAnsi="Thonburi" w:eastAsia="Thonburi"/>
+                <w:rFonts w:ascii="Tahoma" w:hAnsi="Tahoma" w:eastAsia="Tahoma" w:cs="Tahoma"/>
                 <w:color w:val="172033"/>
                 <w:sz w:val="18"/>
+                <w:cs/>
+                <w:lang w:val="th-TH" w:bidi="th-TH"/>
               </w:rPr>
               <w:t>สถานะ</w:t>
             </w:r>
@@ -1358,9 +1470,11 @@
             </w:pPr>
             <w:r>
               <w:rPr>
-                <w:rFonts w:ascii="Thonburi" w:hAnsi="Thonburi" w:eastAsia="Thonburi"/>
+                <w:rFonts w:ascii="Tahoma" w:hAnsi="Tahoma" w:eastAsia="Tahoma" w:cs="Tahoma"/>
                 <w:color w:val="172033"/>
                 <w:sz w:val="18"/>
+                <w:cs/>
+                <w:lang w:val="th-TH" w:bidi="th-TH"/>
               </w:rPr>
               <w:t>ใช่</w:t>
             </w:r>
@@ -1384,9 +1498,11 @@
             </w:pPr>
             <w:r>
               <w:rPr>
-                <w:rFonts w:ascii="Thonburi" w:hAnsi="Thonburi" w:eastAsia="Thonburi"/>
+                <w:rFonts w:ascii="Tahoma" w:hAnsi="Tahoma" w:eastAsia="Tahoma" w:cs="Tahoma"/>
                 <w:color w:val="172033"/>
                 <w:sz w:val="18"/>
+                <w:cs/>
+                <w:lang w:val="th-TH" w:bidi="th-TH"/>
               </w:rPr>
               <w:t>ออนไลน์</w:t>
             </w:r>
@@ -1410,9 +1526,11 @@
             </w:pPr>
             <w:r>
               <w:rPr>
-                <w:rFonts w:ascii="Thonburi" w:hAnsi="Thonburi" w:eastAsia="Thonburi"/>
+                <w:rFonts w:ascii="Tahoma" w:hAnsi="Tahoma" w:eastAsia="Tahoma" w:cs="Tahoma"/>
                 <w:color w:val="172033"/>
                 <w:sz w:val="18"/>
+                <w:cs/>
+                <w:lang w:val="th-TH" w:bidi="th-TH"/>
               </w:rPr>
               <w:t>สถานะการให้บริการของกล้อง</w:t>
             </w:r>
@@ -1439,9 +1557,11 @@
             </w:pPr>
             <w:r>
               <w:rPr>
-                <w:rFonts w:ascii="Thonburi" w:hAnsi="Thonburi" w:eastAsia="Thonburi"/>
+                <w:rFonts w:ascii="Tahoma" w:hAnsi="Tahoma" w:eastAsia="Tahoma" w:cs="Tahoma"/>
                 <w:color w:val="172033"/>
                 <w:sz w:val="18"/>
+                <w:cs/>
+                <w:lang w:val="th-TH" w:bidi="th-TH"/>
               </w:rPr>
               <w:t>อำเภอ</w:t>
             </w:r>
@@ -1466,9 +1586,11 @@
             </w:pPr>
             <w:r>
               <w:rPr>
-                <w:rFonts w:ascii="Thonburi" w:hAnsi="Thonburi" w:eastAsia="Thonburi"/>
+                <w:rFonts w:ascii="Tahoma" w:hAnsi="Tahoma" w:eastAsia="Tahoma" w:cs="Tahoma"/>
                 <w:color w:val="172033"/>
                 <w:sz w:val="18"/>
+                <w:cs/>
+                <w:lang w:val="th-TH" w:bidi="th-TH"/>
               </w:rPr>
               <w:t>ไม่</w:t>
             </w:r>
@@ -1493,9 +1615,11 @@
             </w:pPr>
             <w:r>
               <w:rPr>
-                <w:rFonts w:ascii="Thonburi" w:hAnsi="Thonburi" w:eastAsia="Thonburi"/>
+                <w:rFonts w:ascii="Tahoma" w:hAnsi="Tahoma" w:eastAsia="Tahoma" w:cs="Tahoma"/>
                 <w:color w:val="172033"/>
                 <w:sz w:val="18"/>
+                <w:cs/>
+                <w:lang w:val="th-TH" w:bidi="th-TH"/>
               </w:rPr>
               <w:t>เมืองสิงห์บุรี</w:t>
             </w:r>
@@ -1520,9 +1644,11 @@
             </w:pPr>
             <w:r>
               <w:rPr>
-                <w:rFonts w:ascii="Thonburi" w:hAnsi="Thonburi" w:eastAsia="Thonburi"/>
+                <w:rFonts w:ascii="Tahoma" w:hAnsi="Tahoma" w:eastAsia="Tahoma" w:cs="Tahoma"/>
                 <w:color w:val="172033"/>
                 <w:sz w:val="18"/>
+                <w:cs/>
+                <w:lang w:val="th-TH" w:bidi="th-TH"/>
               </w:rPr>
               <w:t>ช่วยค้นหาและกรองกล้องตามพื้นที่</w:t>
             </w:r>
@@ -1548,9 +1674,11 @@
             </w:pPr>
             <w:r>
               <w:rPr>
-                <w:rFonts w:ascii="Thonburi" w:hAnsi="Thonburi" w:eastAsia="Thonburi"/>
+                <w:rFonts w:ascii="Tahoma" w:hAnsi="Tahoma" w:eastAsia="Tahoma" w:cs="Tahoma"/>
                 <w:color w:val="172033"/>
                 <w:sz w:val="18"/>
+                <w:cs/>
+                <w:lang w:val="th-TH" w:bidi="th-TH"/>
               </w:rPr>
               <w:t>ละติจูด/ลองจิจูด</w:t>
             </w:r>
@@ -1574,9 +1702,11 @@
             </w:pPr>
             <w:r>
               <w:rPr>
-                <w:rFonts w:ascii="Thonburi" w:hAnsi="Thonburi" w:eastAsia="Thonburi"/>
+                <w:rFonts w:ascii="Tahoma" w:hAnsi="Tahoma" w:eastAsia="Tahoma" w:cs="Tahoma"/>
                 <w:color w:val="172033"/>
                 <w:sz w:val="18"/>
+                <w:cs/>
+                <w:lang w:val="th-TH" w:bidi="th-TH"/>
               </w:rPr>
               <w:t>ไม่</w:t>
             </w:r>
@@ -1600,7 +1730,7 @@
             </w:pPr>
             <w:r>
               <w:rPr>
-                <w:rFonts w:ascii="Thonburi" w:hAnsi="Thonburi" w:eastAsia="Thonburi"/>
+                <w:rFonts w:ascii="Tahoma" w:hAnsi="Tahoma" w:eastAsia="Tahoma" w:cs="Tahoma"/>
                 <w:color w:val="172033"/>
                 <w:sz w:val="18"/>
               </w:rPr>
@@ -1626,9 +1756,11 @@
             </w:pPr>
             <w:r>
               <w:rPr>
-                <w:rFonts w:ascii="Thonburi" w:hAnsi="Thonburi" w:eastAsia="Thonburi"/>
+                <w:rFonts w:ascii="Tahoma" w:hAnsi="Tahoma" w:eastAsia="Tahoma" w:cs="Tahoma"/>
                 <w:color w:val="172033"/>
                 <w:sz w:val="18"/>
+                <w:cs/>
+                <w:lang w:val="th-TH" w:bidi="th-TH"/>
               </w:rPr>
               <w:t>ใช้แสดงตำแหน่งกล้องบนแผนที่</w:t>
             </w:r>
@@ -1653,18 +1785,22 @@
       </w:pPr>
       <w:r>
         <w:rPr>
-          <w:rFonts w:ascii="Thonburi" w:hAnsi="Thonburi" w:eastAsia="Thonburi"/>
+          <w:rFonts w:ascii="Tahoma" w:hAnsi="Tahoma" w:eastAsia="Tahoma" w:cs="Tahoma"/>
           <w:b/>
           <w:color w:val="0072CE"/>
           <w:sz w:val="21"/>
+          <w:cs/>
+          <w:lang w:val="th-TH" w:bidi="th-TH"/>
         </w:rPr>
         <w:t xml:space="preserve">กล้องเดิมจาก seed data  </w:t>
       </w:r>
       <w:r>
         <w:rPr>
-          <w:rFonts w:ascii="Thonburi" w:hAnsi="Thonburi" w:eastAsia="Thonburi"/>
+          <w:rFonts w:ascii="Tahoma" w:hAnsi="Tahoma" w:eastAsia="Tahoma" w:cs="Tahoma"/>
           <w:color w:val="172033"/>
           <w:sz w:val="21"/>
+          <w:cs/>
+          <w:lang w:val="th-TH" w:bidi="th-TH"/>
         </w:rPr>
         <w:t>กล้องสาธิตเดิมยังคงใช้ภาพเดิมของระบบ และจะไม่ดึงภาพจาก Google Drive จนกว่าจะมีการระบุ Google Drive URL ให้กล้องนั้น</w:t>
       </w:r>
@@ -1693,18 +1829,22 @@
       </w:pPr>
       <w:r>
         <w:rPr>
-          <w:rFonts w:ascii="Thonburi" w:hAnsi="Thonburi" w:eastAsia="Thonburi"/>
+          <w:rFonts w:ascii="Tahoma" w:hAnsi="Tahoma" w:eastAsia="Tahoma" w:cs="Tahoma"/>
           <w:b/>
           <w:color w:val="0B2545"/>
           <w:sz w:val="22"/>
+          <w:cs/>
+          <w:lang w:val="th-TH" w:bidi="th-TH"/>
         </w:rPr>
         <w:t>ค้นหากล้องที่เพิ่งสร้าง</w:t>
       </w:r>
       <w:r>
         <w:rPr>
-          <w:rFonts w:ascii="Thonburi" w:hAnsi="Thonburi" w:eastAsia="Thonburi"/>
+          <w:rFonts w:ascii="Tahoma" w:hAnsi="Tahoma" w:eastAsia="Tahoma" w:cs="Tahoma"/>
           <w:color w:val="172033"/>
           <w:sz w:val="22"/>
+          <w:cs/>
+          <w:lang w:val="th-TH" w:bidi="th-TH"/>
         </w:rPr>
         <w:t xml:space="preserve"> — ดูจากรหัสหรือชื่อกล้อง</w:t>
       </w:r>
@@ -1720,18 +1860,22 @@
       </w:pPr>
       <w:r>
         <w:rPr>
-          <w:rFonts w:ascii="Thonburi" w:hAnsi="Thonburi" w:eastAsia="Thonburi"/>
+          <w:rFonts w:ascii="Tahoma" w:hAnsi="Tahoma" w:eastAsia="Tahoma" w:cs="Tahoma"/>
           <w:b/>
           <w:color w:val="0B2545"/>
           <w:sz w:val="22"/>
+          <w:cs/>
+          <w:lang w:val="th-TH" w:bidi="th-TH"/>
         </w:rPr>
         <w:t>ตรวจป้ายใต้ภาพ</w:t>
       </w:r>
       <w:r>
         <w:rPr>
-          <w:rFonts w:ascii="Thonburi" w:hAnsi="Thonburi" w:eastAsia="Thonburi"/>
+          <w:rFonts w:ascii="Tahoma" w:hAnsi="Tahoma" w:eastAsia="Tahoma" w:cs="Tahoma"/>
           <w:color w:val="172033"/>
           <w:sz w:val="22"/>
+          <w:cs/>
+          <w:lang w:val="th-TH" w:bidi="th-TH"/>
         </w:rPr>
         <w:t xml:space="preserve"> — ควรแสดง “Google Drive · 5s”</w:t>
       </w:r>
@@ -1747,18 +1891,22 @@
       </w:pPr>
       <w:r>
         <w:rPr>
-          <w:rFonts w:ascii="Thonburi" w:hAnsi="Thonburi" w:eastAsia="Thonburi"/>
+          <w:rFonts w:ascii="Tahoma" w:hAnsi="Tahoma" w:eastAsia="Tahoma" w:cs="Tahoma"/>
           <w:b/>
           <w:color w:val="0B2545"/>
           <w:sz w:val="22"/>
+          <w:cs/>
+          <w:lang w:val="th-TH" w:bidi="th-TH"/>
         </w:rPr>
         <w:t>รอการดึงภาพครั้งแรก</w:t>
       </w:r>
       <w:r>
         <w:rPr>
-          <w:rFonts w:ascii="Thonburi" w:hAnsi="Thonburi" w:eastAsia="Thonburi"/>
+          <w:rFonts w:ascii="Tahoma" w:hAnsi="Tahoma" w:eastAsia="Tahoma" w:cs="Tahoma"/>
           <w:color w:val="172033"/>
           <w:sz w:val="22"/>
+          <w:cs/>
+          <w:lang w:val="th-TH" w:bidi="th-TH"/>
         </w:rPr>
         <w:t xml:space="preserve"> — ระบบจะแสดงภาพที่แก้ไขล่าสุดจากวันที่ล่าสุด</w:t>
       </w:r>
@@ -1774,18 +1922,22 @@
       </w:pPr>
       <w:r>
         <w:rPr>
-          <w:rFonts w:ascii="Thonburi" w:hAnsi="Thonburi" w:eastAsia="Thonburi"/>
+          <w:rFonts w:ascii="Tahoma" w:hAnsi="Tahoma" w:eastAsia="Tahoma" w:cs="Tahoma"/>
           <w:b/>
           <w:color w:val="0B2545"/>
           <w:sz w:val="22"/>
+          <w:cs/>
+          <w:lang w:val="th-TH" w:bidi="th-TH"/>
         </w:rPr>
         <w:t>ทดสอบอัปเดต</w:t>
       </w:r>
       <w:r>
         <w:rPr>
-          <w:rFonts w:ascii="Thonburi" w:hAnsi="Thonburi" w:eastAsia="Thonburi"/>
+          <w:rFonts w:ascii="Tahoma" w:hAnsi="Tahoma" w:eastAsia="Tahoma" w:cs="Tahoma"/>
           <w:color w:val="172033"/>
           <w:sz w:val="22"/>
+          <w:cs/>
+          <w:lang w:val="th-TH" w:bidi="th-TH"/>
         </w:rPr>
         <w:t xml:space="preserve"> — เพิ่มภาพใหม่ในโฟลเดอร์วันปัจจุบัน แล้วรอประมาณ 5 วินาที</w:t>
       </w:r>
@@ -1802,18 +1954,22 @@
       </w:pPr>
       <w:r>
         <w:rPr>
-          <w:rFonts w:ascii="Thonburi" w:hAnsi="Thonburi" w:eastAsia="Thonburi"/>
+          <w:rFonts w:ascii="Tahoma" w:hAnsi="Tahoma" w:eastAsia="Tahoma" w:cs="Tahoma"/>
           <w:b/>
           <w:color w:val="0072CE"/>
           <w:sz w:val="21"/>
+          <w:cs/>
+          <w:lang w:val="th-TH" w:bidi="th-TH"/>
         </w:rPr>
         <w:t xml:space="preserve">พฤติกรรมการรีเฟรช  </w:t>
       </w:r>
       <w:r>
         <w:rPr>
-          <w:rFonts w:ascii="Thonburi" w:hAnsi="Thonburi" w:eastAsia="Thonburi"/>
+          <w:rFonts w:ascii="Tahoma" w:hAnsi="Tahoma" w:eastAsia="Tahoma" w:cs="Tahoma"/>
           <w:color w:val="172033"/>
           <w:sz w:val="21"/>
+          <w:cs/>
+          <w:lang w:val="th-TH" w:bidi="th-TH"/>
         </w:rPr>
         <w:t>ระบบรีเฟรชเฉพาะรูปของกล้องที่มี Google Drive URL ไม่โหลดหน้าใหม่ ไม่เปลี่ยนตัวกรอง และไม่รบกวนกล้องอื่น</w:t>
       </w:r>
@@ -1837,18 +1993,22 @@
       </w:pPr>
       <w:r>
         <w:rPr>
-          <w:rFonts w:ascii="Thonburi" w:hAnsi="Thonburi" w:eastAsia="Thonburi"/>
+          <w:rFonts w:ascii="Tahoma" w:hAnsi="Tahoma" w:eastAsia="Tahoma" w:cs="Tahoma"/>
           <w:b/>
           <w:color w:val="0B2545"/>
           <w:sz w:val="22"/>
+          <w:cs/>
+          <w:lang w:val="th-TH" w:bidi="th-TH"/>
         </w:rPr>
         <w:t>เลือกกล้องจากรายการ</w:t>
       </w:r>
       <w:r>
         <w:rPr>
-          <w:rFonts w:ascii="Thonburi" w:hAnsi="Thonburi" w:eastAsia="Thonburi"/>
+          <w:rFonts w:ascii="Tahoma" w:hAnsi="Tahoma" w:eastAsia="Tahoma" w:cs="Tahoma"/>
           <w:color w:val="172033"/>
           <w:sz w:val="22"/>
+          <w:cs/>
+          <w:lang w:val="th-TH" w:bidi="th-TH"/>
         </w:rPr>
         <w:t xml:space="preserve"> — เปิดรายละเอียดกล้องทางด้านขวา</w:t>
       </w:r>
@@ -1864,18 +2024,22 @@
       </w:pPr>
       <w:r>
         <w:rPr>
-          <w:rFonts w:ascii="Thonburi" w:hAnsi="Thonburi" w:eastAsia="Thonburi"/>
+          <w:rFonts w:ascii="Tahoma" w:hAnsi="Tahoma" w:eastAsia="Tahoma" w:cs="Tahoma"/>
           <w:b/>
           <w:color w:val="0B2545"/>
           <w:sz w:val="22"/>
+          <w:cs/>
+          <w:lang w:val="th-TH" w:bidi="th-TH"/>
         </w:rPr>
         <w:t>ไปที่จัดการกล้อง</w:t>
       </w:r>
       <w:r>
         <w:rPr>
-          <w:rFonts w:ascii="Thonburi" w:hAnsi="Thonburi" w:eastAsia="Thonburi"/>
+          <w:rFonts w:ascii="Tahoma" w:hAnsi="Tahoma" w:eastAsia="Tahoma" w:cs="Tahoma"/>
           <w:color w:val="172033"/>
           <w:sz w:val="22"/>
+          <w:cs/>
+          <w:lang w:val="th-TH" w:bidi="th-TH"/>
         </w:rPr>
         <w:t xml:space="preserve"> — กด “แก้ไข”</w:t>
       </w:r>
@@ -1891,18 +2055,22 @@
       </w:pPr>
       <w:r>
         <w:rPr>
-          <w:rFonts w:ascii="Thonburi" w:hAnsi="Thonburi" w:eastAsia="Thonburi"/>
+          <w:rFonts w:ascii="Tahoma" w:hAnsi="Tahoma" w:eastAsia="Tahoma" w:cs="Tahoma"/>
           <w:b/>
           <w:color w:val="0B2545"/>
           <w:sz w:val="22"/>
+          <w:cs/>
+          <w:lang w:val="th-TH" w:bidi="th-TH"/>
         </w:rPr>
         <w:t>แก้ไข Google Drive folder URL</w:t>
       </w:r>
       <w:r>
         <w:rPr>
-          <w:rFonts w:ascii="Thonburi" w:hAnsi="Thonburi" w:eastAsia="Thonburi"/>
+          <w:rFonts w:ascii="Tahoma" w:hAnsi="Tahoma" w:eastAsia="Tahoma" w:cs="Tahoma"/>
           <w:color w:val="172033"/>
           <w:sz w:val="22"/>
+          <w:cs/>
+          <w:lang w:val="th-TH" w:bidi="th-TH"/>
         </w:rPr>
         <w:t xml:space="preserve"> — วาง URL ใหม่ หรือเว้นว่างเพื่อตัดการเชื่อมต่อ Drive</w:t>
       </w:r>
@@ -1918,18 +2086,22 @@
       </w:pPr>
       <w:r>
         <w:rPr>
-          <w:rFonts w:ascii="Thonburi" w:hAnsi="Thonburi" w:eastAsia="Thonburi"/>
+          <w:rFonts w:ascii="Tahoma" w:hAnsi="Tahoma" w:eastAsia="Tahoma" w:cs="Tahoma"/>
           <w:b/>
           <w:color w:val="0B2545"/>
           <w:sz w:val="22"/>
+          <w:cs/>
+          <w:lang w:val="th-TH" w:bidi="th-TH"/>
         </w:rPr>
         <w:t>กด “บันทึก”</w:t>
       </w:r>
       <w:r>
         <w:rPr>
-          <w:rFonts w:ascii="Thonburi" w:hAnsi="Thonburi" w:eastAsia="Thonburi"/>
+          <w:rFonts w:ascii="Tahoma" w:hAnsi="Tahoma" w:eastAsia="Tahoma" w:cs="Tahoma"/>
           <w:color w:val="172033"/>
           <w:sz w:val="22"/>
+          <w:cs/>
+          <w:lang w:val="th-TH" w:bidi="th-TH"/>
         </w:rPr>
         <w:t xml:space="preserve"> — ตรวจป้ายแหล่งภาพหลังบันทึก</w:t>
       </w:r>
@@ -1982,10 +2154,12 @@
             </w:pPr>
             <w:r>
               <w:rPr>
-                <w:rFonts w:ascii="Thonburi" w:hAnsi="Thonburi" w:eastAsia="Thonburi"/>
+                <w:rFonts w:ascii="Tahoma" w:hAnsi="Tahoma" w:eastAsia="Tahoma" w:cs="Tahoma"/>
                 <w:b/>
                 <w:color w:val="FFFFFF"/>
                 <w:sz w:val="19"/>
+                <w:cs/>
+                <w:lang w:val="th-TH" w:bidi="th-TH"/>
               </w:rPr>
               <w:t>อาการ</w:t>
             </w:r>
@@ -2010,10 +2184,12 @@
             </w:pPr>
             <w:r>
               <w:rPr>
-                <w:rFonts w:ascii="Thonburi" w:hAnsi="Thonburi" w:eastAsia="Thonburi"/>
+                <w:rFonts w:ascii="Tahoma" w:hAnsi="Tahoma" w:eastAsia="Tahoma" w:cs="Tahoma"/>
                 <w:b/>
                 <w:color w:val="FFFFFF"/>
                 <w:sz w:val="19"/>
+                <w:cs/>
+                <w:lang w:val="th-TH" w:bidi="th-TH"/>
               </w:rPr>
               <w:t>แนวทางตรวจสอบ</w:t>
             </w:r>
@@ -2039,9 +2215,11 @@
             </w:pPr>
             <w:r>
               <w:rPr>
-                <w:rFonts w:ascii="Thonburi" w:hAnsi="Thonburi" w:eastAsia="Thonburi"/>
+                <w:rFonts w:ascii="Tahoma" w:hAnsi="Tahoma" w:eastAsia="Tahoma" w:cs="Tahoma"/>
                 <w:color w:val="172033"/>
                 <w:sz w:val="18"/>
+                <w:cs/>
+                <w:lang w:val="th-TH" w:bidi="th-TH"/>
               </w:rPr>
               <w:t>URL ไม่ผ่านการบันทึก</w:t>
             </w:r>
@@ -2065,9 +2243,11 @@
             </w:pPr>
             <w:r>
               <w:rPr>
-                <w:rFonts w:ascii="Thonburi" w:hAnsi="Thonburi" w:eastAsia="Thonburi"/>
+                <w:rFonts w:ascii="Tahoma" w:hAnsi="Tahoma" w:eastAsia="Tahoma" w:cs="Tahoma"/>
                 <w:color w:val="172033"/>
                 <w:sz w:val="18"/>
+                <w:cs/>
+                <w:lang w:val="th-TH" w:bidi="th-TH"/>
               </w:rPr>
               <w:t>ตรวจว่าเป็น URL ของ drive.google.com/drive/folders/… และไม่ใช่ลิงก์ไฟล์ภาพ</w:t>
             </w:r>
@@ -2094,9 +2274,11 @@
             </w:pPr>
             <w:r>
               <w:rPr>
-                <w:rFonts w:ascii="Thonburi" w:hAnsi="Thonburi" w:eastAsia="Thonburi"/>
+                <w:rFonts w:ascii="Tahoma" w:hAnsi="Tahoma" w:eastAsia="Tahoma" w:cs="Tahoma"/>
                 <w:color w:val="172033"/>
                 <w:sz w:val="18"/>
+                <w:cs/>
+                <w:lang w:val="th-TH" w:bidi="th-TH"/>
               </w:rPr>
               <w:t>ขึ้นว่าอ่าน Google Drive ไม่ได้</w:t>
             </w:r>
@@ -2121,9 +2303,11 @@
             </w:pPr>
             <w:r>
               <w:rPr>
-                <w:rFonts w:ascii="Thonburi" w:hAnsi="Thonburi" w:eastAsia="Thonburi"/>
+                <w:rFonts w:ascii="Tahoma" w:hAnsi="Tahoma" w:eastAsia="Tahoma" w:cs="Tahoma"/>
                 <w:color w:val="172033"/>
                 <w:sz w:val="18"/>
+                <w:cs/>
+                <w:lang w:val="th-TH" w:bidi="th-TH"/>
               </w:rPr>
               <w:t>ตั้ง root folder เป็น Anyone with the link / Viewer แล้วลอง Copy link ใหม่</w:t>
             </w:r>
@@ -2149,9 +2333,11 @@
             </w:pPr>
             <w:r>
               <w:rPr>
-                <w:rFonts w:ascii="Thonburi" w:hAnsi="Thonburi" w:eastAsia="Thonburi"/>
+                <w:rFonts w:ascii="Tahoma" w:hAnsi="Tahoma" w:eastAsia="Tahoma" w:cs="Tahoma"/>
                 <w:color w:val="172033"/>
                 <w:sz w:val="18"/>
+                <w:cs/>
+                <w:lang w:val="th-TH" w:bidi="th-TH"/>
               </w:rPr>
               <w:t>ยังไม่พบภาพในโฟลเดอร์</w:t>
             </w:r>
@@ -2175,9 +2361,11 @@
             </w:pPr>
             <w:r>
               <w:rPr>
-                <w:rFonts w:ascii="Thonburi" w:hAnsi="Thonburi" w:eastAsia="Thonburi"/>
+                <w:rFonts w:ascii="Tahoma" w:hAnsi="Tahoma" w:eastAsia="Tahoma" w:cs="Tahoma"/>
                 <w:color w:val="172033"/>
                 <w:sz w:val="18"/>
+                <w:cs/>
+                <w:lang w:val="th-TH" w:bidi="th-TH"/>
               </w:rPr>
               <w:t>ตรวจโครงสร้าง root/ปี/เดือน/วัน และตรวจว่าไฟล์อยู่ในโฟลเดอร์วันโดยตรง</w:t>
             </w:r>
@@ -2204,9 +2392,11 @@
             </w:pPr>
             <w:r>
               <w:rPr>
-                <w:rFonts w:ascii="Thonburi" w:hAnsi="Thonburi" w:eastAsia="Thonburi"/>
+                <w:rFonts w:ascii="Tahoma" w:hAnsi="Tahoma" w:eastAsia="Tahoma" w:cs="Tahoma"/>
                 <w:color w:val="172033"/>
                 <w:sz w:val="18"/>
+                <w:cs/>
+                <w:lang w:val="th-TH" w:bidi="th-TH"/>
               </w:rPr>
               <w:t>ภาพไม่เปลี่ยนหลังอัปโหลด</w:t>
             </w:r>
@@ -2231,9 +2421,11 @@
             </w:pPr>
             <w:r>
               <w:rPr>
-                <w:rFonts w:ascii="Thonburi" w:hAnsi="Thonburi" w:eastAsia="Thonburi"/>
+                <w:rFonts w:ascii="Tahoma" w:hAnsi="Tahoma" w:eastAsia="Tahoma" w:cs="Tahoma"/>
                 <w:color w:val="172033"/>
                 <w:sz w:val="18"/>
+                <w:cs/>
+                <w:lang w:val="th-TH" w:bidi="th-TH"/>
               </w:rPr>
               <w:t>รออย่างน้อย 5 วินาที ตรวจว่าอัปโหลดเสร็จ และไฟล์ใหม่มีเวลาแก้ไขล่าสุด</w:t>
             </w:r>
@@ -2259,9 +2451,11 @@
             </w:pPr>
             <w:r>
               <w:rPr>
-                <w:rFonts w:ascii="Thonburi" w:hAnsi="Thonburi" w:eastAsia="Thonburi"/>
+                <w:rFonts w:ascii="Tahoma" w:hAnsi="Tahoma" w:eastAsia="Tahoma" w:cs="Tahoma"/>
                 <w:color w:val="172033"/>
                 <w:sz w:val="18"/>
+                <w:cs/>
+                <w:lang w:val="th-TH" w:bidi="th-TH"/>
               </w:rPr>
               <w:t>ขึ้นว่ายังไม่ได้ตั้งค่า API Key</w:t>
             </w:r>
@@ -2285,9 +2479,11 @@
             </w:pPr>
             <w:r>
               <w:rPr>
-                <w:rFonts w:ascii="Thonburi" w:hAnsi="Thonburi" w:eastAsia="Thonburi"/>
+                <w:rFonts w:ascii="Tahoma" w:hAnsi="Tahoma" w:eastAsia="Tahoma" w:cs="Tahoma"/>
                 <w:color w:val="172033"/>
                 <w:sz w:val="18"/>
+                <w:cs/>
+                <w:lang w:val="th-TH" w:bidi="th-TH"/>
               </w:rPr>
               <w:t>ติดต่อผู้ดูแลระบบให้ตั้ง GOOGLE_DRIVE_API_KEY และ restart ระบบ</w:t>
             </w:r>
@@ -2314,9 +2510,11 @@
             </w:pPr>
             <w:r>
               <w:rPr>
-                <w:rFonts w:ascii="Thonburi" w:hAnsi="Thonburi" w:eastAsia="Thonburi"/>
+                <w:rFonts w:ascii="Tahoma" w:hAnsi="Tahoma" w:eastAsia="Tahoma" w:cs="Tahoma"/>
                 <w:color w:val="172033"/>
                 <w:sz w:val="18"/>
+                <w:cs/>
+                <w:lang w:val="th-TH" w:bidi="th-TH"/>
               </w:rPr>
               <w:t>ไม่พบปุ่มเพิ่มหรือแก้ไขกล้อง</w:t>
             </w:r>
@@ -2341,9 +2539,11 @@
             </w:pPr>
             <w:r>
               <w:rPr>
-                <w:rFonts w:ascii="Thonburi" w:hAnsi="Thonburi" w:eastAsia="Thonburi"/>
+                <w:rFonts w:ascii="Tahoma" w:hAnsi="Tahoma" w:eastAsia="Tahoma" w:cs="Tahoma"/>
                 <w:color w:val="172033"/>
                 <w:sz w:val="18"/>
+                <w:cs/>
+                <w:lang w:val="th-TH" w:bidi="th-TH"/>
               </w:rPr>
               <w:t>บัญชีไม่มีสิทธิ์ cctv.manage ให้ติดต่อผู้ดูแลระบบ</w:t>
             </w:r>
@@ -2369,9 +2569,11 @@
             </w:pPr>
             <w:r>
               <w:rPr>
-                <w:rFonts w:ascii="Thonburi" w:hAnsi="Thonburi" w:eastAsia="Thonburi"/>
+                <w:rFonts w:ascii="Tahoma" w:hAnsi="Tahoma" w:eastAsia="Tahoma" w:cs="Tahoma"/>
                 <w:color w:val="172033"/>
                 <w:sz w:val="18"/>
+                <w:cs/>
+                <w:lang w:val="th-TH" w:bidi="th-TH"/>
               </w:rPr>
               <w:t>ภาพจากกล้อง seed ยังเป็นภาพเดิม</w:t>
             </w:r>
@@ -2395,9 +2597,11 @@
             </w:pPr>
             <w:r>
               <w:rPr>
-                <w:rFonts w:ascii="Thonburi" w:hAnsi="Thonburi" w:eastAsia="Thonburi"/>
+                <w:rFonts w:ascii="Tahoma" w:hAnsi="Tahoma" w:eastAsia="Tahoma" w:cs="Tahoma"/>
                 <w:color w:val="172033"/>
                 <w:sz w:val="18"/>
+                <w:cs/>
+                <w:lang w:val="th-TH" w:bidi="th-TH"/>
               </w:rPr>
               <w:t>เป็นพฤติกรรมที่ถูกต้อง กล้อง seed จะคงภาพเดิมหากไม่ได้ระบุ Google Drive URL</w:t>
             </w:r>
@@ -2426,7 +2630,7 @@
       </w:pPr>
       <w:r>
         <w:rPr>
-          <w:rFonts w:ascii="Arial Unicode MS" w:hAnsi="Arial Unicode MS" w:eastAsia="Arial Unicode MS"/>
+          <w:rFonts w:ascii="Arial Unicode MS" w:hAnsi="Arial Unicode MS" w:eastAsia="Arial Unicode MS" w:cs="Arial Unicode MS"/>
           <w:color w:val="0072CE"/>
           <w:sz w:val="22"/>
         </w:rPr>
@@ -2434,9 +2638,11 @@
       </w:r>
       <w:r>
         <w:rPr>
-          <w:rFonts w:ascii="Thonburi" w:hAnsi="Thonburi" w:eastAsia="Thonburi"/>
+          <w:rFonts w:ascii="Tahoma" w:hAnsi="Tahoma" w:eastAsia="Tahoma" w:cs="Tahoma"/>
           <w:color w:val="172033"/>
           <w:sz w:val="22"/>
+          <w:cs/>
+          <w:lang w:val="th-TH" w:bidi="th-TH"/>
         </w:rPr>
         <w:t>สร้าง root folder แยกสำหรับกล้องแต่ละตัว</w:t>
       </w:r>
@@ -2449,7 +2655,7 @@
       </w:pPr>
       <w:r>
         <w:rPr>
-          <w:rFonts w:ascii="Arial Unicode MS" w:hAnsi="Arial Unicode MS" w:eastAsia="Arial Unicode MS"/>
+          <w:rFonts w:ascii="Arial Unicode MS" w:hAnsi="Arial Unicode MS" w:eastAsia="Arial Unicode MS" w:cs="Arial Unicode MS"/>
           <w:color w:val="0072CE"/>
           <w:sz w:val="22"/>
         </w:rPr>
@@ -2457,9 +2663,11 @@
       </w:r>
       <w:r>
         <w:rPr>
-          <w:rFonts w:ascii="Thonburi" w:hAnsi="Thonburi" w:eastAsia="Thonburi"/>
+          <w:rFonts w:ascii="Tahoma" w:hAnsi="Tahoma" w:eastAsia="Tahoma" w:cs="Tahoma"/>
           <w:color w:val="172033"/>
           <w:sz w:val="22"/>
+          <w:cs/>
+          <w:lang w:val="th-TH" w:bidi="th-TH"/>
         </w:rPr>
         <w:t>สร้างโฟลเดอร์ ปี/เดือน/วัน ด้วยชื่อที่เป็นตัวเลข</w:t>
       </w:r>
@@ -2472,7 +2680,7 @@
       </w:pPr>
       <w:r>
         <w:rPr>
-          <w:rFonts w:ascii="Arial Unicode MS" w:hAnsi="Arial Unicode MS" w:eastAsia="Arial Unicode MS"/>
+          <w:rFonts w:ascii="Arial Unicode MS" w:hAnsi="Arial Unicode MS" w:eastAsia="Arial Unicode MS" w:cs="Arial Unicode MS"/>
           <w:color w:val="0072CE"/>
           <w:sz w:val="22"/>
         </w:rPr>
@@ -2480,9 +2688,11 @@
       </w:r>
       <w:r>
         <w:rPr>
-          <w:rFonts w:ascii="Thonburi" w:hAnsi="Thonburi" w:eastAsia="Thonburi"/>
+          <w:rFonts w:ascii="Tahoma" w:hAnsi="Tahoma" w:eastAsia="Tahoma" w:cs="Tahoma"/>
           <w:color w:val="172033"/>
           <w:sz w:val="22"/>
+          <w:cs/>
+          <w:lang w:val="th-TH" w:bidi="th-TH"/>
         </w:rPr>
         <w:t>อัปโหลดไฟล์ภาพไว้ในโฟลเดอร์วัน</w:t>
       </w:r>
@@ -2495,7 +2705,7 @@
       </w:pPr>
       <w:r>
         <w:rPr>
-          <w:rFonts w:ascii="Arial Unicode MS" w:hAnsi="Arial Unicode MS" w:eastAsia="Arial Unicode MS"/>
+          <w:rFonts w:ascii="Arial Unicode MS" w:hAnsi="Arial Unicode MS" w:eastAsia="Arial Unicode MS" w:cs="Arial Unicode MS"/>
           <w:color w:val="0072CE"/>
           <w:sz w:val="22"/>
         </w:rPr>
@@ -2503,9 +2713,11 @@
       </w:r>
       <w:r>
         <w:rPr>
-          <w:rFonts w:ascii="Thonburi" w:hAnsi="Thonburi" w:eastAsia="Thonburi"/>
+          <w:rFonts w:ascii="Tahoma" w:hAnsi="Tahoma" w:eastAsia="Tahoma" w:cs="Tahoma"/>
           <w:color w:val="172033"/>
           <w:sz w:val="22"/>
+          <w:cs/>
+          <w:lang w:val="th-TH" w:bidi="th-TH"/>
         </w:rPr>
         <w:t>แชร์ root folder เป็น Anyone with the link / Viewer</w:t>
       </w:r>
@@ -2518,7 +2730,7 @@
       </w:pPr>
       <w:r>
         <w:rPr>
-          <w:rFonts w:ascii="Arial Unicode MS" w:hAnsi="Arial Unicode MS" w:eastAsia="Arial Unicode MS"/>
+          <w:rFonts w:ascii="Arial Unicode MS" w:hAnsi="Arial Unicode MS" w:eastAsia="Arial Unicode MS" w:cs="Arial Unicode MS"/>
           <w:color w:val="0072CE"/>
           <w:sz w:val="22"/>
         </w:rPr>
@@ -2526,9 +2738,11 @@
       </w:r>
       <w:r>
         <w:rPr>
-          <w:rFonts w:ascii="Thonburi" w:hAnsi="Thonburi" w:eastAsia="Thonburi"/>
+          <w:rFonts w:ascii="Tahoma" w:hAnsi="Tahoma" w:eastAsia="Tahoma" w:cs="Tahoma"/>
           <w:color w:val="172033"/>
           <w:sz w:val="22"/>
+          <w:cs/>
+          <w:lang w:val="th-TH" w:bidi="th-TH"/>
         </w:rPr>
         <w:t>วาง URL ของ root folder ในฟอร์มกล้อง</w:t>
       </w:r>
@@ -2541,7 +2755,7 @@
       </w:pPr>
       <w:r>
         <w:rPr>
-          <w:rFonts w:ascii="Arial Unicode MS" w:hAnsi="Arial Unicode MS" w:eastAsia="Arial Unicode MS"/>
+          <w:rFonts w:ascii="Arial Unicode MS" w:hAnsi="Arial Unicode MS" w:eastAsia="Arial Unicode MS" w:cs="Arial Unicode MS"/>
           <w:color w:val="0072CE"/>
           <w:sz w:val="22"/>
         </w:rPr>
@@ -2549,9 +2763,11 @@
       </w:r>
       <w:r>
         <w:rPr>
-          <w:rFonts w:ascii="Thonburi" w:hAnsi="Thonburi" w:eastAsia="Thonburi"/>
+          <w:rFonts w:ascii="Tahoma" w:hAnsi="Tahoma" w:eastAsia="Tahoma" w:cs="Tahoma"/>
           <w:color w:val="172033"/>
           <w:sz w:val="22"/>
+          <w:cs/>
+          <w:lang w:val="th-TH" w:bidi="th-TH"/>
         </w:rPr>
         <w:t>เห็นป้าย Google Drive · 5s และภาพล่าสุดบนการ์ดกล้อง</w:t>
       </w:r>
@@ -2568,18 +2784,22 @@
       </w:pPr>
       <w:r>
         <w:rPr>
-          <w:rFonts w:ascii="Thonburi" w:hAnsi="Thonburi" w:eastAsia="Thonburi"/>
+          <w:rFonts w:ascii="Tahoma" w:hAnsi="Tahoma" w:eastAsia="Tahoma" w:cs="Tahoma"/>
           <w:b/>
           <w:color w:val="9A7500"/>
           <w:sz w:val="21"/>
+          <w:cs/>
+          <w:lang w:val="th-TH" w:bidi="th-TH"/>
         </w:rPr>
         <w:t xml:space="preserve">ติดต่อผู้ดูแลระบบเมื่อ  </w:t>
       </w:r>
       <w:r>
         <w:rPr>
-          <w:rFonts w:ascii="Thonburi" w:hAnsi="Thonburi" w:eastAsia="Thonburi"/>
+          <w:rFonts w:ascii="Tahoma" w:hAnsi="Tahoma" w:eastAsia="Tahoma" w:cs="Tahoma"/>
           <w:color w:val="172033"/>
           <w:sz w:val="21"/>
+          <w:cs/>
+          <w:lang w:val="th-TH" w:bidi="th-TH"/>
         </w:rPr>
         <w:t>โฟลเดอร์แชร์ถูกต้องและโครงสร้างครบ แต่ยังพบข้อผิดพลาดเกี่ยวกับ API Key, สิทธิ์ผู้ใช้ หรือระบบไม่สามารถเชื่อมต่อ Google Drive ได้</w:t>
       </w:r>
@@ -2592,10 +2812,12 @@
       </w:pPr>
       <w:r>
         <w:rPr>
-          <w:rFonts w:ascii="Thonburi" w:hAnsi="Thonburi" w:eastAsia="Thonburi"/>
+          <w:rFonts w:ascii="Tahoma" w:hAnsi="Tahoma" w:eastAsia="Tahoma" w:cs="Tahoma"/>
           <w:b/>
           <w:color w:val="0B2545"/>
           <w:sz w:val="22"/>
+          <w:cs/>
+          <w:lang w:val="th-TH" w:bidi="th-TH"/>
         </w:rPr>
         <w:t>จบคู่มือ</w:t>
       </w:r>
@@ -2623,15 +2845,17 @@
     </w:pPr>
     <w:r>
       <w:rPr>
-        <w:rFonts w:ascii="Thonburi" w:hAnsi="Thonburi" w:eastAsia="Thonburi"/>
+        <w:rFonts w:ascii="Tahoma" w:hAnsi="Tahoma" w:eastAsia="Tahoma" w:cs="Tahoma"/>
         <w:color w:val="596579"/>
         <w:sz w:val="17"/>
+        <w:cs/>
+        <w:lang w:val="th-TH" w:bidi="th-TH"/>
       </w:rPr>
       <w:t xml:space="preserve">หน้า </w:t>
     </w:r>
     <w:r>
       <w:rPr>
-        <w:rFonts w:ascii="Thonburi" w:hAnsi="Thonburi" w:eastAsia="Thonburi"/>
+        <w:rFonts w:ascii="Tahoma" w:hAnsi="Tahoma" w:eastAsia="Tahoma" w:cs="Tahoma"/>
         <w:color w:val="596579"/>
         <w:sz w:val="17"/>
       </w:rPr>
@@ -2653,15 +2877,17 @@
     </w:pPr>
     <w:r>
       <w:rPr>
-        <w:rFonts w:ascii="Thonburi" w:hAnsi="Thonburi" w:eastAsia="Thonburi"/>
+        <w:rFonts w:ascii="Tahoma" w:hAnsi="Tahoma" w:eastAsia="Tahoma" w:cs="Tahoma"/>
         <w:color w:val="596579"/>
         <w:sz w:val="17"/>
+        <w:cs/>
+        <w:lang w:val="th-TH" w:bidi="th-TH"/>
       </w:rPr>
       <w:t xml:space="preserve">หน้า </w:t>
     </w:r>
     <w:r>
       <w:rPr>
-        <w:rFonts w:ascii="Thonburi" w:hAnsi="Thonburi" w:eastAsia="Thonburi"/>
+        <w:rFonts w:ascii="Tahoma" w:hAnsi="Tahoma" w:eastAsia="Tahoma" w:cs="Tahoma"/>
         <w:color w:val="596579"/>
         <w:sz w:val="17"/>
       </w:rPr>
@@ -2688,10 +2914,12 @@
     </w:pPr>
     <w:r>
       <w:rPr>
-        <w:rFonts w:ascii="Thonburi" w:hAnsi="Thonburi" w:eastAsia="Thonburi"/>
+        <w:rFonts w:ascii="Tahoma" w:hAnsi="Tahoma" w:eastAsia="Tahoma" w:cs="Tahoma"/>
         <w:b/>
         <w:color w:val="596579"/>
         <w:sz w:val="17"/>
+        <w:cs/>
+        <w:lang w:val="th-TH" w:bidi="th-TH"/>
       </w:rPr>
       <w:t>คู่มือผู้ใช้งาน  •  Digital Twin CCTV</w:t>
     </w:r>
@@ -2713,10 +2941,12 @@
     </w:pPr>
     <w:r>
       <w:rPr>
-        <w:rFonts w:ascii="Thonburi" w:hAnsi="Thonburi" w:eastAsia="Thonburi"/>
+        <w:rFonts w:ascii="Tahoma" w:hAnsi="Tahoma" w:eastAsia="Tahoma" w:cs="Tahoma"/>
         <w:b/>
         <w:color w:val="596579"/>
         <w:sz w:val="17"/>
+        <w:cs/>
+        <w:lang w:val="th-TH" w:bidi="th-TH"/>
       </w:rPr>
       <w:t>คู่มือผู้ใช้งาน  •  Digital Twin CCTV</w:t>
     </w:r>
@@ -2939,7 +3169,7 @@
         <w:spacing w:after="80" w:line="300" w:lineRule="auto"/>
       </w:pPr>
       <w:rPr>
-        <w:rFonts w:ascii="Thonburi" w:hAnsi="Thonburi" w:eastAsia="Thonburi"/>
+        <w:rFonts w:ascii="Tahoma" w:hAnsi="Tahoma" w:eastAsia="Tahoma" w:cs="Tahoma"/>
       </w:rPr>
     </w:lvl>
   </w:abstractNum>
@@ -2961,7 +3191,7 @@
         <w:spacing w:after="80" w:line="300" w:lineRule="auto"/>
       </w:pPr>
       <w:rPr>
-        <w:rFonts w:ascii="Thonburi" w:hAnsi="Thonburi" w:eastAsia="Thonburi"/>
+        <w:rFonts w:ascii="Tahoma" w:hAnsi="Tahoma" w:eastAsia="Tahoma" w:cs="Tahoma"/>
       </w:rPr>
     </w:lvl>
   </w:abstractNum>
@@ -2983,7 +3213,7 @@
         <w:spacing w:after="80" w:line="300" w:lineRule="auto"/>
       </w:pPr>
       <w:rPr>
-        <w:rFonts w:ascii="Thonburi" w:hAnsi="Thonburi" w:eastAsia="Thonburi"/>
+        <w:rFonts w:ascii="Tahoma" w:hAnsi="Tahoma" w:eastAsia="Tahoma" w:cs="Tahoma"/>
       </w:rPr>
     </w:lvl>
   </w:abstractNum>
@@ -3005,7 +3235,7 @@
         <w:spacing w:after="80" w:line="300" w:lineRule="auto"/>
       </w:pPr>
       <w:rPr>
-        <w:rFonts w:ascii="Thonburi" w:hAnsi="Thonburi" w:eastAsia="Thonburi"/>
+        <w:rFonts w:ascii="Tahoma" w:hAnsi="Tahoma" w:eastAsia="Tahoma" w:cs="Tahoma"/>
       </w:rPr>
     </w:lvl>
   </w:abstractNum>
@@ -3027,7 +3257,7 @@
         <w:spacing w:after="80" w:line="300" w:lineRule="auto"/>
       </w:pPr>
       <w:rPr>
-        <w:rFonts w:ascii="Thonburi" w:hAnsi="Thonburi" w:eastAsia="Thonburi"/>
+        <w:rFonts w:ascii="Tahoma" w:hAnsi="Tahoma" w:eastAsia="Tahoma" w:cs="Tahoma"/>
       </w:rPr>
     </w:lvl>
   </w:abstractNum>
@@ -3201,7 +3431,7 @@
       <w:spacing w:before="0" w:after="120" w:line="300" w:lineRule="auto"/>
     </w:pPr>
     <w:rPr>
-      <w:rFonts w:ascii="Thonburi" w:hAnsi="Thonburi" w:eastAsia="Thonburi"/>
+      <w:rFonts w:ascii="Tahoma" w:hAnsi="Tahoma" w:eastAsia="Tahoma" w:cs="Tahoma"/>
       <w:color w:val="172033"/>
       <w:sz w:val="22"/>
     </w:rPr>
@@ -3265,7 +3495,7 @@
       <w:outlineLvl w:val="0"/>
     </w:pPr>
     <w:rPr>
-      <w:rFonts w:asciiTheme="majorHAnsi" w:eastAsiaTheme="majorEastAsia" w:hAnsiTheme="majorHAnsi" w:cstheme="majorBidi" w:ascii="Thonburi" w:hAnsi="Thonburi" w:eastAsia="Thonburi"/>
+      <w:rFonts w:asciiTheme="majorHAnsi" w:eastAsiaTheme="majorEastAsia" w:hAnsiTheme="majorHAnsi" w:cstheme="majorBidi" w:ascii="Tahoma" w:hAnsi="Tahoma" w:eastAsia="Tahoma" w:cs="Tahoma"/>
       <w:b/>
       <w:bCs/>
       <w:color w:val="0072CE"/>
@@ -3289,7 +3519,7 @@
       <w:outlineLvl w:val="1"/>
     </w:pPr>
     <w:rPr>
-      <w:rFonts w:asciiTheme="majorHAnsi" w:eastAsiaTheme="majorEastAsia" w:hAnsiTheme="majorHAnsi" w:cstheme="majorBidi" w:ascii="Thonburi" w:hAnsi="Thonburi" w:eastAsia="Thonburi"/>
+      <w:rFonts w:asciiTheme="majorHAnsi" w:eastAsiaTheme="majorEastAsia" w:hAnsiTheme="majorHAnsi" w:cstheme="majorBidi" w:ascii="Tahoma" w:hAnsi="Tahoma" w:eastAsia="Tahoma" w:cs="Tahoma"/>
       <w:b/>
       <w:bCs/>
       <w:color w:val="0072CE"/>
@@ -3313,7 +3543,7 @@
       <w:outlineLvl w:val="2"/>
     </w:pPr>
     <w:rPr>
-      <w:rFonts w:asciiTheme="majorHAnsi" w:eastAsiaTheme="majorEastAsia" w:hAnsiTheme="majorHAnsi" w:cstheme="majorBidi" w:ascii="Thonburi" w:hAnsi="Thonburi" w:eastAsia="Thonburi"/>
+      <w:rFonts w:asciiTheme="majorHAnsi" w:eastAsiaTheme="majorEastAsia" w:hAnsiTheme="majorHAnsi" w:cstheme="majorBidi" w:ascii="Tahoma" w:hAnsi="Tahoma" w:eastAsia="Tahoma" w:cs="Tahoma"/>
       <w:b/>
       <w:bCs/>
       <w:color w:val="0B2545"/>

</xml_diff>